<commit_message>
Fronted|combined home and data on mobile app
</commit_message>
<xml_diff>
--- a/Sustav za praćenje treninga na vreći za udaranje.docx
+++ b/Sustav za praćenje treninga na vreći za udaranje.docx
@@ -343,7 +343,7 @@
         </w:rPr>
         <w:fldChar w:fldCharType="separate"/>
       </w:r>
-      <w:hyperlink w:anchor="_Toc229765529" w:history="1">
+      <w:hyperlink w:anchor="_Toc230097430" w:history="1">
         <w:r>
           <w:rPr>
             <w:rStyle w:val="Hiperveza"/>
@@ -370,7 +370,7 @@
             <w:noProof/>
             <w:webHidden/>
           </w:rPr>
-          <w:instrText xml:space="preserve"> PAGEREF _Toc229765529 \h </w:instrText>
+          <w:instrText xml:space="preserve"> PAGEREF _Toc230097430 \h </w:instrText>
         </w:r>
         <w:r>
           <w:rPr>
@@ -414,7 +414,7 @@
           <w:lang w:eastAsia="hr-HR"/>
         </w:rPr>
       </w:pPr>
-      <w:hyperlink w:anchor="_Toc229765530" w:history="1">
+      <w:hyperlink w:anchor="_Toc230097431" w:history="1">
         <w:r>
           <w:rPr>
             <w:rStyle w:val="Hiperveza"/>
@@ -456,7 +456,7 @@
             <w:noProof/>
             <w:webHidden/>
           </w:rPr>
-          <w:instrText xml:space="preserve"> PAGEREF _Toc229765530 \h </w:instrText>
+          <w:instrText xml:space="preserve"> PAGEREF _Toc230097431 \h </w:instrText>
         </w:r>
         <w:r>
           <w:rPr>
@@ -476,7 +476,7 @@
             <w:noProof/>
             <w:webHidden/>
           </w:rPr>
-          <w:t>5</w:t>
+          <w:t>4</w:t>
         </w:r>
         <w:r>
           <w:rPr>
@@ -500,7 +500,7 @@
           <w:lang w:eastAsia="hr-HR"/>
         </w:rPr>
       </w:pPr>
-      <w:hyperlink w:anchor="_Toc229765531" w:history="1">
+      <w:hyperlink w:anchor="_Toc230097432" w:history="1">
         <w:r>
           <w:rPr>
             <w:rStyle w:val="Hiperveza"/>
@@ -521,7 +521,7 @@
             <w:rStyle w:val="Hiperveza"/>
             <w:noProof/>
           </w:rPr>
-          <w:t>Pregled sustava i arhitektura</w:t>
+          <w:t>Arhitektura i dizajn sustava</w:t>
         </w:r>
         <w:r>
           <w:rPr>
@@ -542,7 +542,179 @@
             <w:noProof/>
             <w:webHidden/>
           </w:rPr>
-          <w:instrText xml:space="preserve"> PAGEREF _Toc229765531 \h </w:instrText>
+          <w:instrText xml:space="preserve"> PAGEREF _Toc230097432 \h </w:instrText>
+        </w:r>
+        <w:r>
+          <w:rPr>
+            <w:noProof/>
+            <w:webHidden/>
+          </w:rPr>
+        </w:r>
+        <w:r>
+          <w:rPr>
+            <w:noProof/>
+            <w:webHidden/>
+          </w:rPr>
+          <w:fldChar w:fldCharType="separate"/>
+        </w:r>
+        <w:r>
+          <w:rPr>
+            <w:noProof/>
+            <w:webHidden/>
+          </w:rPr>
+          <w:t>6</w:t>
+        </w:r>
+        <w:r>
+          <w:rPr>
+            <w:noProof/>
+            <w:webHidden/>
+          </w:rPr>
+          <w:fldChar w:fldCharType="end"/>
+        </w:r>
+      </w:hyperlink>
+    </w:p>
+    <w:p>
+      <w:pPr>
+        <w:pStyle w:val="Sadraj2"/>
+        <w:tabs>
+          <w:tab w:val="left" w:pos="960"/>
+          <w:tab w:val="right" w:leader="dot" w:pos="8777"/>
+        </w:tabs>
+        <w:rPr>
+          <w:rFonts w:asciiTheme="minorHAnsi" w:eastAsiaTheme="minorEastAsia" w:hAnsiTheme="minorHAnsi"/>
+          <w:noProof/>
+          <w:lang w:eastAsia="hr-HR"/>
+        </w:rPr>
+      </w:pPr>
+      <w:hyperlink w:anchor="_Toc230097433" w:history="1">
+        <w:r>
+          <w:rPr>
+            <w:rStyle w:val="Hiperveza"/>
+            <w:noProof/>
+          </w:rPr>
+          <w:t>2.1</w:t>
+        </w:r>
+        <w:r>
+          <w:rPr>
+            <w:rFonts w:asciiTheme="minorHAnsi" w:eastAsiaTheme="minorEastAsia" w:hAnsiTheme="minorHAnsi"/>
+            <w:noProof/>
+            <w:lang w:eastAsia="hr-HR"/>
+          </w:rPr>
+          <w:tab/>
+        </w:r>
+        <w:r>
+          <w:rPr>
+            <w:rStyle w:val="Hiperveza"/>
+            <w:noProof/>
+          </w:rPr>
+          <w:t>Glavne komponente sustava</w:t>
+        </w:r>
+        <w:r>
+          <w:rPr>
+            <w:noProof/>
+            <w:webHidden/>
+          </w:rPr>
+          <w:tab/>
+        </w:r>
+        <w:r>
+          <w:rPr>
+            <w:noProof/>
+            <w:webHidden/>
+          </w:rPr>
+          <w:fldChar w:fldCharType="begin"/>
+        </w:r>
+        <w:r>
+          <w:rPr>
+            <w:noProof/>
+            <w:webHidden/>
+          </w:rPr>
+          <w:instrText xml:space="preserve"> PAGEREF _Toc230097433 \h </w:instrText>
+        </w:r>
+        <w:r>
+          <w:rPr>
+            <w:noProof/>
+            <w:webHidden/>
+          </w:rPr>
+        </w:r>
+        <w:r>
+          <w:rPr>
+            <w:noProof/>
+            <w:webHidden/>
+          </w:rPr>
+          <w:fldChar w:fldCharType="separate"/>
+        </w:r>
+        <w:r>
+          <w:rPr>
+            <w:noProof/>
+            <w:webHidden/>
+          </w:rPr>
+          <w:t>6</w:t>
+        </w:r>
+        <w:r>
+          <w:rPr>
+            <w:noProof/>
+            <w:webHidden/>
+          </w:rPr>
+          <w:fldChar w:fldCharType="end"/>
+        </w:r>
+      </w:hyperlink>
+    </w:p>
+    <w:p>
+      <w:pPr>
+        <w:pStyle w:val="Sadraj2"/>
+        <w:tabs>
+          <w:tab w:val="left" w:pos="960"/>
+          <w:tab w:val="right" w:leader="dot" w:pos="8777"/>
+        </w:tabs>
+        <w:rPr>
+          <w:rFonts w:asciiTheme="minorHAnsi" w:eastAsiaTheme="minorEastAsia" w:hAnsiTheme="minorHAnsi"/>
+          <w:noProof/>
+          <w:lang w:eastAsia="hr-HR"/>
+        </w:rPr>
+      </w:pPr>
+      <w:hyperlink w:anchor="_Toc230097434" w:history="1">
+        <w:r>
+          <w:rPr>
+            <w:rStyle w:val="Hiperveza"/>
+            <w:noProof/>
+          </w:rPr>
+          <w:t>2.2</w:t>
+        </w:r>
+        <w:r>
+          <w:rPr>
+            <w:rFonts w:asciiTheme="minorHAnsi" w:eastAsiaTheme="minorEastAsia" w:hAnsiTheme="minorHAnsi"/>
+            <w:noProof/>
+            <w:lang w:eastAsia="hr-HR"/>
+          </w:rPr>
+          <w:tab/>
+        </w:r>
+        <w:r>
+          <w:rPr>
+            <w:rStyle w:val="Hiperveza"/>
+            <w:noProof/>
+          </w:rPr>
+          <w:t>Komunikacija i protok podataka</w:t>
+        </w:r>
+        <w:r>
+          <w:rPr>
+            <w:noProof/>
+            <w:webHidden/>
+          </w:rPr>
+          <w:tab/>
+        </w:r>
+        <w:r>
+          <w:rPr>
+            <w:noProof/>
+            <w:webHidden/>
+          </w:rPr>
+          <w:fldChar w:fldCharType="begin"/>
+        </w:r>
+        <w:r>
+          <w:rPr>
+            <w:noProof/>
+            <w:webHidden/>
+          </w:rPr>
+          <w:instrText xml:space="preserve"> PAGEREF _Toc230097434 \h </w:instrText>
         </w:r>
         <w:r>
           <w:rPr>
@@ -586,7 +758,7 @@
           <w:lang w:eastAsia="hr-HR"/>
         </w:rPr>
       </w:pPr>
-      <w:hyperlink w:anchor="_Toc229765532" w:history="1">
+      <w:hyperlink w:anchor="_Toc230097435" w:history="1">
         <w:r>
           <w:rPr>
             <w:rStyle w:val="Hiperveza"/>
@@ -628,7 +800,7 @@
             <w:noProof/>
             <w:webHidden/>
           </w:rPr>
-          <w:instrText xml:space="preserve"> PAGEREF _Toc229765532 \h </w:instrText>
+          <w:instrText xml:space="preserve"> PAGEREF _Toc230097435 \h </w:instrText>
         </w:r>
         <w:r>
           <w:rPr>
@@ -648,7 +820,7 @@
             <w:noProof/>
             <w:webHidden/>
           </w:rPr>
-          <w:t>7</w:t>
+          <w:t>8</w:t>
         </w:r>
         <w:r>
           <w:rPr>
@@ -672,7 +844,7 @@
           <w:lang w:eastAsia="hr-HR"/>
         </w:rPr>
       </w:pPr>
-      <w:hyperlink w:anchor="_Toc229765533" w:history="1">
+      <w:hyperlink w:anchor="_Toc230097436" w:history="1">
         <w:r>
           <w:rPr>
             <w:rStyle w:val="Hiperveza"/>
@@ -714,7 +886,7 @@
             <w:noProof/>
             <w:webHidden/>
           </w:rPr>
-          <w:instrText xml:space="preserve"> PAGEREF _Toc229765533 \h </w:instrText>
+          <w:instrText xml:space="preserve"> PAGEREF _Toc230097436 \h </w:instrText>
         </w:r>
         <w:r>
           <w:rPr>
@@ -734,7 +906,7 @@
             <w:noProof/>
             <w:webHidden/>
           </w:rPr>
-          <w:t>8</w:t>
+          <w:t>9</w:t>
         </w:r>
         <w:r>
           <w:rPr>
@@ -758,7 +930,7 @@
           <w:lang w:eastAsia="hr-HR"/>
         </w:rPr>
       </w:pPr>
-      <w:hyperlink w:anchor="_Toc229765534" w:history="1">
+      <w:hyperlink w:anchor="_Toc230097437" w:history="1">
         <w:r>
           <w:rPr>
             <w:rStyle w:val="Hiperveza"/>
@@ -800,7 +972,7 @@
             <w:noProof/>
             <w:webHidden/>
           </w:rPr>
-          <w:instrText xml:space="preserve"> PAGEREF _Toc229765534 \h </w:instrText>
+          <w:instrText xml:space="preserve"> PAGEREF _Toc230097437 \h </w:instrText>
         </w:r>
         <w:r>
           <w:rPr>
@@ -820,7 +992,7 @@
             <w:noProof/>
             <w:webHidden/>
           </w:rPr>
-          <w:t>8</w:t>
+          <w:t>9</w:t>
         </w:r>
         <w:r>
           <w:rPr>
@@ -844,7 +1016,7 @@
           <w:lang w:eastAsia="hr-HR"/>
         </w:rPr>
       </w:pPr>
-      <w:hyperlink w:anchor="_Toc229765535" w:history="1">
+      <w:hyperlink w:anchor="_Toc230097438" w:history="1">
         <w:r>
           <w:rPr>
             <w:rStyle w:val="Hiperveza"/>
@@ -886,7 +1058,7 @@
             <w:noProof/>
             <w:webHidden/>
           </w:rPr>
-          <w:instrText xml:space="preserve"> PAGEREF _Toc229765535 \h </w:instrText>
+          <w:instrText xml:space="preserve"> PAGEREF _Toc230097438 \h </w:instrText>
         </w:r>
         <w:r>
           <w:rPr>
@@ -906,7 +1078,7 @@
             <w:noProof/>
             <w:webHidden/>
           </w:rPr>
-          <w:t>8</w:t>
+          <w:t>9</w:t>
         </w:r>
         <w:r>
           <w:rPr>
@@ -930,7 +1102,7 @@
           <w:lang w:eastAsia="hr-HR"/>
         </w:rPr>
       </w:pPr>
-      <w:hyperlink w:anchor="_Toc229765536" w:history="1">
+      <w:hyperlink w:anchor="_Toc230097439" w:history="1">
         <w:r>
           <w:rPr>
             <w:rStyle w:val="Hiperveza"/>
@@ -972,7 +1144,7 @@
             <w:noProof/>
             <w:webHidden/>
           </w:rPr>
-          <w:instrText xml:space="preserve"> PAGEREF _Toc229765536 \h </w:instrText>
+          <w:instrText xml:space="preserve"> PAGEREF _Toc230097439 \h </w:instrText>
         </w:r>
         <w:r>
           <w:rPr>
@@ -992,7 +1164,7 @@
             <w:noProof/>
             <w:webHidden/>
           </w:rPr>
-          <w:t>8</w:t>
+          <w:t>9</w:t>
         </w:r>
         <w:r>
           <w:rPr>
@@ -1016,7 +1188,7 @@
           <w:lang w:eastAsia="hr-HR"/>
         </w:rPr>
       </w:pPr>
-      <w:hyperlink w:anchor="_Toc229765537" w:history="1">
+      <w:hyperlink w:anchor="_Toc230097440" w:history="1">
         <w:r>
           <w:rPr>
             <w:rStyle w:val="Hiperveza"/>
@@ -1058,7 +1230,7 @@
             <w:noProof/>
             <w:webHidden/>
           </w:rPr>
-          <w:instrText xml:space="preserve"> PAGEREF _Toc229765537 \h </w:instrText>
+          <w:instrText xml:space="preserve"> PAGEREF _Toc230097440 \h </w:instrText>
         </w:r>
         <w:r>
           <w:rPr>
@@ -1078,7 +1250,7 @@
             <w:noProof/>
             <w:webHidden/>
           </w:rPr>
-          <w:t>8</w:t>
+          <w:t>9</w:t>
         </w:r>
         <w:r>
           <w:rPr>
@@ -1102,7 +1274,7 @@
           <w:lang w:eastAsia="hr-HR"/>
         </w:rPr>
       </w:pPr>
-      <w:hyperlink w:anchor="_Toc229765538" w:history="1">
+      <w:hyperlink w:anchor="_Toc230097441" w:history="1">
         <w:r>
           <w:rPr>
             <w:rStyle w:val="Hiperveza"/>
@@ -1144,7 +1316,7 @@
             <w:noProof/>
             <w:webHidden/>
           </w:rPr>
-          <w:instrText xml:space="preserve"> PAGEREF _Toc229765538 \h </w:instrText>
+          <w:instrText xml:space="preserve"> PAGEREF _Toc230097441 \h </w:instrText>
         </w:r>
         <w:r>
           <w:rPr>
@@ -1164,7 +1336,7 @@
             <w:noProof/>
             <w:webHidden/>
           </w:rPr>
-          <w:t>9</w:t>
+          <w:t>10</w:t>
         </w:r>
         <w:r>
           <w:rPr>
@@ -1188,7 +1360,7 @@
           <w:lang w:eastAsia="hr-HR"/>
         </w:rPr>
       </w:pPr>
-      <w:hyperlink w:anchor="_Toc229765539" w:history="1">
+      <w:hyperlink w:anchor="_Toc230097442" w:history="1">
         <w:r>
           <w:rPr>
             <w:rStyle w:val="Hiperveza"/>
@@ -1230,7 +1402,7 @@
             <w:noProof/>
             <w:webHidden/>
           </w:rPr>
-          <w:instrText xml:space="preserve"> PAGEREF _Toc229765539 \h </w:instrText>
+          <w:instrText xml:space="preserve"> PAGEREF _Toc230097442 \h </w:instrText>
         </w:r>
         <w:r>
           <w:rPr>
@@ -1250,7 +1422,7 @@
             <w:noProof/>
             <w:webHidden/>
           </w:rPr>
-          <w:t>9</w:t>
+          <w:t>10</w:t>
         </w:r>
         <w:r>
           <w:rPr>
@@ -1274,7 +1446,7 @@
           <w:lang w:eastAsia="hr-HR"/>
         </w:rPr>
       </w:pPr>
-      <w:hyperlink w:anchor="_Toc229765540" w:history="1">
+      <w:hyperlink w:anchor="_Toc230097443" w:history="1">
         <w:r>
           <w:rPr>
             <w:rStyle w:val="Hiperveza"/>
@@ -1316,7 +1488,7 @@
             <w:noProof/>
             <w:webHidden/>
           </w:rPr>
-          <w:instrText xml:space="preserve"> PAGEREF _Toc229765540 \h </w:instrText>
+          <w:instrText xml:space="preserve"> PAGEREF _Toc230097443 \h </w:instrText>
         </w:r>
         <w:r>
           <w:rPr>
@@ -1336,7 +1508,7 @@
             <w:noProof/>
             <w:webHidden/>
           </w:rPr>
-          <w:t>9</w:t>
+          <w:t>10</w:t>
         </w:r>
         <w:r>
           <w:rPr>
@@ -1360,7 +1532,7 @@
           <w:lang w:eastAsia="hr-HR"/>
         </w:rPr>
       </w:pPr>
-      <w:hyperlink w:anchor="_Toc229765541" w:history="1">
+      <w:hyperlink w:anchor="_Toc230097444" w:history="1">
         <w:r>
           <w:rPr>
             <w:rStyle w:val="Hiperveza"/>
@@ -1402,7 +1574,7 @@
             <w:noProof/>
             <w:webHidden/>
           </w:rPr>
-          <w:instrText xml:space="preserve"> PAGEREF _Toc229765541 \h </w:instrText>
+          <w:instrText xml:space="preserve"> PAGEREF _Toc230097444 \h </w:instrText>
         </w:r>
         <w:r>
           <w:rPr>
@@ -1422,7 +1594,7 @@
             <w:noProof/>
             <w:webHidden/>
           </w:rPr>
-          <w:t>10</w:t>
+          <w:t>11</w:t>
         </w:r>
         <w:r>
           <w:rPr>
@@ -1446,7 +1618,7 @@
           <w:lang w:eastAsia="hr-HR"/>
         </w:rPr>
       </w:pPr>
-      <w:hyperlink w:anchor="_Toc229765542" w:history="1">
+      <w:hyperlink w:anchor="_Toc230097445" w:history="1">
         <w:r>
           <w:rPr>
             <w:rStyle w:val="Hiperveza"/>
@@ -1488,7 +1660,7 @@
             <w:noProof/>
             <w:webHidden/>
           </w:rPr>
-          <w:instrText xml:space="preserve"> PAGEREF _Toc229765542 \h </w:instrText>
+          <w:instrText xml:space="preserve"> PAGEREF _Toc230097445 \h </w:instrText>
         </w:r>
         <w:r>
           <w:rPr>
@@ -1508,7 +1680,7 @@
             <w:noProof/>
             <w:webHidden/>
           </w:rPr>
-          <w:t>10</w:t>
+          <w:t>11</w:t>
         </w:r>
         <w:r>
           <w:rPr>
@@ -1532,7 +1704,7 @@
           <w:lang w:eastAsia="hr-HR"/>
         </w:rPr>
       </w:pPr>
-      <w:hyperlink w:anchor="_Toc229765543" w:history="1">
+      <w:hyperlink w:anchor="_Toc230097446" w:history="1">
         <w:r>
           <w:rPr>
             <w:rStyle w:val="Hiperveza"/>
@@ -1574,7 +1746,7 @@
             <w:noProof/>
             <w:webHidden/>
           </w:rPr>
-          <w:instrText xml:space="preserve"> PAGEREF _Toc229765543 \h </w:instrText>
+          <w:instrText xml:space="preserve"> PAGEREF _Toc230097446 \h </w:instrText>
         </w:r>
         <w:r>
           <w:rPr>
@@ -1594,7 +1766,7 @@
             <w:noProof/>
             <w:webHidden/>
           </w:rPr>
-          <w:t>11</w:t>
+          <w:t>12</w:t>
         </w:r>
         <w:r>
           <w:rPr>
@@ -1617,7 +1789,7 @@
           <w:lang w:eastAsia="hr-HR"/>
         </w:rPr>
       </w:pPr>
-      <w:hyperlink w:anchor="_Toc229765544" w:history="1">
+      <w:hyperlink w:anchor="_Toc230097447" w:history="1">
         <w:r>
           <w:rPr>
             <w:rStyle w:val="Hiperveza"/>
@@ -1644,7 +1816,7 @@
             <w:noProof/>
             <w:webHidden/>
           </w:rPr>
-          <w:instrText xml:space="preserve"> PAGEREF _Toc229765544 \h </w:instrText>
+          <w:instrText xml:space="preserve"> PAGEREF _Toc230097447 \h </w:instrText>
         </w:r>
         <w:r>
           <w:rPr>
@@ -1664,7 +1836,7 @@
             <w:noProof/>
             <w:webHidden/>
           </w:rPr>
-          <w:t>12</w:t>
+          <w:t>13</w:t>
         </w:r>
         <w:r>
           <w:rPr>
@@ -1687,7 +1859,7 @@
           <w:lang w:eastAsia="hr-HR"/>
         </w:rPr>
       </w:pPr>
-      <w:hyperlink w:anchor="_Toc229765545" w:history="1">
+      <w:hyperlink w:anchor="_Toc230097448" w:history="1">
         <w:r>
           <w:rPr>
             <w:rStyle w:val="Hiperveza"/>
@@ -1714,7 +1886,7 @@
             <w:noProof/>
             <w:webHidden/>
           </w:rPr>
-          <w:instrText xml:space="preserve"> PAGEREF _Toc229765545 \h </w:instrText>
+          <w:instrText xml:space="preserve"> PAGEREF _Toc230097448 \h </w:instrText>
         </w:r>
         <w:r>
           <w:rPr>
@@ -1734,7 +1906,7 @@
             <w:noProof/>
             <w:webHidden/>
           </w:rPr>
-          <w:t>12</w:t>
+          <w:t>13</w:t>
         </w:r>
         <w:r>
           <w:rPr>
@@ -1757,7 +1929,7 @@
           <w:lang w:eastAsia="hr-HR"/>
         </w:rPr>
       </w:pPr>
-      <w:hyperlink w:anchor="_Toc229765546" w:history="1">
+      <w:hyperlink w:anchor="_Toc230097449" w:history="1">
         <w:r>
           <w:rPr>
             <w:rStyle w:val="Hiperveza"/>
@@ -1784,7 +1956,7 @@
             <w:noProof/>
             <w:webHidden/>
           </w:rPr>
-          <w:instrText xml:space="preserve"> PAGEREF _Toc229765546 \h </w:instrText>
+          <w:instrText xml:space="preserve"> PAGEREF _Toc230097449 \h </w:instrText>
         </w:r>
         <w:r>
           <w:rPr>
@@ -1804,7 +1976,7 @@
             <w:noProof/>
             <w:webHidden/>
           </w:rPr>
-          <w:t>12</w:t>
+          <w:t>14</w:t>
         </w:r>
         <w:r>
           <w:rPr>
@@ -1827,7 +1999,7 @@
           <w:lang w:eastAsia="hr-HR"/>
         </w:rPr>
       </w:pPr>
-      <w:hyperlink w:anchor="_Toc229765547" w:history="1">
+      <w:hyperlink w:anchor="_Toc230097450" w:history="1">
         <w:r>
           <w:rPr>
             <w:rStyle w:val="Hiperveza"/>
@@ -1854,7 +2026,7 @@
             <w:noProof/>
             <w:webHidden/>
           </w:rPr>
-          <w:instrText xml:space="preserve"> PAGEREF _Toc229765547 \h </w:instrText>
+          <w:instrText xml:space="preserve"> PAGEREF _Toc230097450 \h </w:instrText>
         </w:r>
         <w:r>
           <w:rPr>
@@ -1874,7 +2046,7 @@
             <w:noProof/>
             <w:webHidden/>
           </w:rPr>
-          <w:t>12</w:t>
+          <w:t>16</w:t>
         </w:r>
         <w:r>
           <w:rPr>
@@ -1929,7 +2101,7 @@
         </w:numPr>
         <w:ind w:left="432" w:hanging="432"/>
       </w:pPr>
-      <w:bookmarkStart w:id="0" w:name="_Toc229765529"/>
+      <w:bookmarkStart w:id="0" w:name="_Toc230097430"/>
       <w:r>
         <w:lastRenderedPageBreak/>
         <w:t>Uvod</w:t>
@@ -1938,46 +2110,28 @@
     </w:p>
     <w:p>
       <w:pPr>
+        <w:pStyle w:val="Naslov1"/>
+      </w:pPr>
+      <w:bookmarkStart w:id="1" w:name="_Toc230097431"/>
+      <w:r>
+        <w:t>Povezani radovi</w:t>
+      </w:r>
+      <w:bookmarkEnd w:id="1"/>
+    </w:p>
+    <w:p>
+      <w:pPr>
         <w:ind w:firstLine="432"/>
       </w:pPr>
       <w:r>
-        <w:t xml:space="preserve">Digitalna analitika treninga postaje sve važnija u sportu i rekreaciji, </w:t>
-      </w:r>
-      <w:r>
-        <w:t xml:space="preserve">čime se omogućuje objektivna povratna informacija i dugoročno praćenje izvedbe treninga. U </w:t>
-      </w:r>
-      <w:r>
-        <w:t>borilačkim sportovima, treninzi na vreći za udaranje najčešće se procjenjuju subjektivno, dok su mjerljivi pokazatelji poput broja udaraca, raspodjele intenziteta udar</w:t>
-      </w:r>
-      <w:r>
-        <w:t>a</w:t>
-      </w:r>
-      <w:r>
-        <w:t xml:space="preserve">ca i </w:t>
-      </w:r>
-      <w:r>
-        <w:t xml:space="preserve">usporedbe rezultata </w:t>
-      </w:r>
-      <w:r>
-        <w:t>dvaju treninga rijetko dostupni bez specijalizirane i skupe opreme</w:t>
-      </w:r>
-      <w:r>
-        <w:t xml:space="preserve"> </w:t>
-      </w:r>
-      <w:r>
-        <w:t>Također je potreban sustav koji korisniku tijekom treninga omogućuje jednostavno korištenje, neovisno o količini opreme koju nosi.</w:t>
-      </w:r>
-      <w:r>
-        <w:t xml:space="preserve"> </w:t>
-      </w:r>
-      <w:r>
-        <w:t xml:space="preserve">To potiče razvoj pristupačnih i </w:t>
-      </w:r>
-      <w:r>
-        <w:t xml:space="preserve">proširivih sustava koji mogu prikupljati podatke sa senzora, obrađivati ih u stvarnom vremenu te prikazivati </w:t>
-      </w:r>
-      <w:r>
-        <w:t>relevantnu statistiku treninga kroz jednostavno korisničko sučelje</w:t>
+        <w:t xml:space="preserve">Istraživačka i komercijalna rješenja za praćenje statistike udaraca u borilačkim sportovima obično se dijele u tri kategorije: mete ili vreće s ugrađenim senzorima, nosivi senzori (rukavice, narukvice) te hibridni sustavi koji kombiniraju više različitih senzorskih uređaja. Usko povezani prethodni rad Vinkovića i suradnika predstavlja pristupačan prototip za treninge na vreći za udaranje, koji procjenjuje relativnu snagu i frekvenciju udaraca korištenjem </w:t>
+      </w:r>
+      <w:proofErr w:type="spellStart"/>
+      <w:r>
+        <w:t>akcelerometra</w:t>
+      </w:r>
+      <w:proofErr w:type="spellEnd"/>
+      <w:r>
+        <w:t>. U tom je radu također prikazana izvedivost razlikovanja udaraca od vibracija ili njihanja vreće u stvarnim uvjetima treninga [1]. Ovaj rad se nadovezuje na prethodno istraživanje, koristeći njihov sustav za prikupljanje podataka koji se potom šalju aplikaciji u kojoj se izračunava statistika treninga.</w:t>
       </w:r>
     </w:p>
     <w:p>
@@ -1985,44 +2139,91 @@
         <w:ind w:firstLine="432"/>
       </w:pPr>
       <w:r>
-        <w:t>U ovom radu prikazan je takav web-orijentirani sustav za praćenje, obradu i vizualizaciju podataka treninga na vreći za udaranje</w:t>
-      </w:r>
-      <w:r>
-        <w:t xml:space="preserve"> u stvarnom vremenu. Rješenje integrira ugradbeni mjerni uređaj (</w:t>
-      </w:r>
-      <w:proofErr w:type="spellStart"/>
-      <w:r>
-        <w:t>akcelerometarske</w:t>
-      </w:r>
-      <w:proofErr w:type="spellEnd"/>
-      <w:r>
-        <w:t xml:space="preserve"> senzore), pozadinski sustav u Node.js okruženju za auten</w:t>
-      </w:r>
-      <w:r>
-        <w:t xml:space="preserve">tifikaciju, upravljanje sesijama i prijenos podataka, te web i mobilnu aplikaciju koje omogućuju praćenje </w:t>
-      </w:r>
-      <w:r>
-        <w:t xml:space="preserve">treninga uživo i analizu podataka nakon treninga. Ugradbeni uređaj šalje izmjerene vrijednosti na poslužitelj putem </w:t>
-      </w:r>
-      <w:proofErr w:type="spellStart"/>
-      <w:r>
-        <w:t>WebSocket</w:t>
-      </w:r>
-      <w:proofErr w:type="spellEnd"/>
-      <w:r>
-        <w:t xml:space="preserve"> </w:t>
-      </w:r>
-      <w:r>
-        <w:t>veze</w:t>
-      </w:r>
-      <w:r>
-        <w:t>, što omogućuj</w:t>
-      </w:r>
-      <w:r>
-        <w:t xml:space="preserve">e dvosmjernu komunikaciju niske latencije za upravljanje </w:t>
-      </w:r>
-      <w:r>
-        <w:t xml:space="preserve">treninzima te slanje konfiguracijskih ili ažurirajućih naredbi. Na poslužiteljskoj strani izmjereni podaci, korisnički i sesijski podaci pohranjuju se u </w:t>
+        <w:t xml:space="preserve">Uobičajen pristup u biomehanici je procjena sile udarca na vreći s ugrađenim senzorima kombiniranjem izmjerene akceleracije i mase vreće pod pojednostavljenim pretpostavkama sustava. </w:t>
+      </w:r>
+      <w:proofErr w:type="spellStart"/>
+      <w:r>
+        <w:t>Buśko</w:t>
+      </w:r>
+      <w:proofErr w:type="spellEnd"/>
+      <w:r>
+        <w:t xml:space="preserve"> i suradnici opisuju modificiranu vreću za udaranje s ugrađenim inercijskim senzorima te predstavljaju model prema kojem se sila udarca izračunava iz izmjerene akceleracije i mase vreće, uz navođenje točnosti mjerenja u kontroliranim eksperimentima [2]. Noviji radovi nastavljaju validaciju i usporedbu sustava za mjerenje udaraca (uključujući nosive senzore i komercijalne uređaje), a pristupi temeljeni na vrećama s ugrađenim senzorima često se navode kao referentni standard za mjerenje kinetike udaraca. Primjerice, studija mjerenja udaraca pomoću </w:t>
+      </w:r>
+      <w:proofErr w:type="spellStart"/>
+      <w:r>
+        <w:t>piezorezistivnih</w:t>
+      </w:r>
+      <w:proofErr w:type="spellEnd"/>
+      <w:r>
+        <w:t xml:space="preserve"> senzora u rukavicama referira se na rad </w:t>
+      </w:r>
+      <w:proofErr w:type="spellStart"/>
+      <w:r>
+        <w:t>Buśka</w:t>
+      </w:r>
+      <w:proofErr w:type="spellEnd"/>
+      <w:r>
+        <w:t xml:space="preserve"> i suradnika u kontekstu ranijih metoda kvantifikacije sile udaraca [3].</w:t>
+      </w:r>
+    </w:p>
+    <w:p>
+      <w:pPr>
+        <w:ind w:firstLine="432"/>
+      </w:pPr>
+      <w:r>
+        <w:t xml:space="preserve">Od komercijalnih proizvoda, jedan od najpoznatijih je aplikacija </w:t>
+      </w:r>
+      <w:proofErr w:type="spellStart"/>
+      <w:r>
+        <w:t>PunchLab</w:t>
+      </w:r>
+      <w:proofErr w:type="spellEnd"/>
+      <w:r>
+        <w:t>, koja omogućuje praćenje statistike treninga, analizu performansi korisnika te pristup savjetima i treninzima drugih trenera putem same aplikacije. Aplikacija omogućuje povezivanje s različitim nosivim senzorima (npr. narukvicama) radi preciznijeg i jednostavnijeg prikupljanja podataka o treninzima. Također je moguće pratiti udarce tako da se mobilni telefon trakom pričvrsti na vreću za udaranje, pri čemu aplikacija koristi senzore pokreta telefona za bilježenje podataka o udarcima i prikaz statistika treninga. Svoje statistike i napredak korisnici mogu međusobno uspoređivati putem rang-lista unutar aplikacije, čime se potiče natjecateljski duh i motivira na češće korištenje aplikacije [4].</w:t>
+      </w:r>
+    </w:p>
+    <w:p>
+      <w:pPr>
+        <w:ind w:firstLine="432"/>
+      </w:pPr>
+      <w:r>
+        <w:lastRenderedPageBreak/>
+        <w:t xml:space="preserve">Sličan sustav prethodnome je </w:t>
+      </w:r>
+      <w:proofErr w:type="spellStart"/>
+      <w:r>
+        <w:t>FightCamp</w:t>
+      </w:r>
+      <w:proofErr w:type="spellEnd"/>
+      <w:r>
+        <w:t xml:space="preserve">, koji pretplatnicima omogućuje korištenje cjelovitog sustava sa senzorima (rukavicama) i opcionalno s vrećom za udaranje, uz aplikaciju koja prati broj udaraca. Aplikacija je primarno namijenjena povezivanju korisnika s treninzima i spajanju senzora putem Bluetootha radi praćenja broja udaraca. Kao i </w:t>
+      </w:r>
+      <w:proofErr w:type="spellStart"/>
+      <w:r>
+        <w:t>PunchLab</w:t>
+      </w:r>
+      <w:proofErr w:type="spellEnd"/>
+      <w:r>
+        <w:t>, sustav sadrži rang-liste na kojima se korisnici mogu uspoređivati s drugima. Omogućeno je i praćenje treninga putem TV-a, uz upute iskusnih trenera. Brojni treninzi postavljaju cilj postizanja određenog broja udaraca, zbog čega je aplikacija vrlo pogodna za brojanje udaraca, no trenutačno ne podržava izračunavanje snage udaraca.</w:t>
+      </w:r>
+      <w:r>
+        <w:t xml:space="preserve"> [6]</w:t>
+      </w:r>
+    </w:p>
+    <w:p>
+      <w:pPr>
+        <w:ind w:firstLine="432"/>
+      </w:pPr>
+      <w:r>
+        <w:t xml:space="preserve">Većina trenutno razvijenih web-sustava za praćenje treninga omogućuje korisnicima praćenje isključivo broja udaraca, dok su oni koji prikazuju i statistiku sile udarca izuzetno rijetki. Također, sustavi poput </w:t>
+      </w:r>
+      <w:proofErr w:type="spellStart"/>
+      <w:r>
+        <w:t>FightCampa</w:t>
+      </w:r>
+      <w:proofErr w:type="spellEnd"/>
+      <w:r>
+        <w:t xml:space="preserve"> od korisnika zahtijevaju kupovinu njihovih senzora te mjesečnu pretplatu za korištenje aplikacije, zbog čega često nisu pristupačni široj populaciji. Potaknut time, ovaj rad opisuje izradu cjelovite, pristupačne i jeftine web-orijentirane arhitekture koja obuhvaća uparivanje putem QR koda, autentifikaciju temeljenu na JWT-u, pohranu sesijskih podataka u </w:t>
       </w:r>
       <w:proofErr w:type="spellStart"/>
       <w:r>
@@ -2030,225 +2231,7 @@
       </w:r>
       <w:proofErr w:type="spellEnd"/>
       <w:r>
-        <w:t xml:space="preserve"> bazu podataka. Na korisničkoj strani aplikacija prikazuje grafi</w:t>
-      </w:r>
-      <w:r>
-        <w:t>kone sa jačinom udarca i izračunava metrike treninga (</w:t>
-      </w:r>
-      <w:r>
-        <w:t>broj udarca, intenzitet udar</w:t>
-      </w:r>
-      <w:r>
-        <w:t>a</w:t>
-      </w:r>
-      <w:r>
-        <w:t>ca koristeći prilagodljivi algoritam za detekciju udarca), a podatke pohranjuje u lokalnu pohranu (</w:t>
-      </w:r>
-      <w:proofErr w:type="spellStart"/>
-      <w:r>
-        <w:t>Local</w:t>
-      </w:r>
-      <w:proofErr w:type="spellEnd"/>
-      <w:r>
-        <w:t xml:space="preserve"> </w:t>
-      </w:r>
-      <w:proofErr w:type="spellStart"/>
-      <w:r>
-        <w:t>Storage</w:t>
-      </w:r>
-      <w:proofErr w:type="spellEnd"/>
-      <w:r>
-        <w:t>) s ciljem smanjenja broja poruka između klijenta i poslužitelja.</w:t>
-      </w:r>
-      <w:r>
-        <w:t xml:space="preserve"> Za pokretanje sesije koristi se skeniranje QR koda kako bi se olakšalo korištenje korisnicima</w:t>
-      </w:r>
-      <w:r>
-        <w:t xml:space="preserve"> </w:t>
-      </w:r>
-      <w:r>
-        <w:t>koji</w:t>
-      </w:r>
-      <w:r>
-        <w:t xml:space="preserve">, </w:t>
-      </w:r>
-      <w:r>
-        <w:t>zbog opreme (rukavice i sl</w:t>
-      </w:r>
-      <w:r>
-        <w:t>.</w:t>
-      </w:r>
-      <w:r>
-        <w:t>)</w:t>
-      </w:r>
-      <w:r>
-        <w:t xml:space="preserve">, </w:t>
-      </w:r>
-      <w:r>
-        <w:t xml:space="preserve">ne mogu previše </w:t>
-      </w:r>
-      <w:r>
-        <w:t>tipkati po uređaju</w:t>
-      </w:r>
-      <w:r>
-        <w:t xml:space="preserve">. </w:t>
-      </w:r>
-    </w:p>
-    <w:p>
-      <w:pPr>
-        <w:ind w:firstLine="432"/>
-      </w:pPr>
-      <w:r>
-        <w:t>Glavni doprinosi ovog rada su:</w:t>
-      </w:r>
-    </w:p>
-    <w:p>
-      <w:pPr>
-        <w:pStyle w:val="Odlomakpopisa"/>
-        <w:numPr>
-          <w:ilvl w:val="0"/>
-          <w:numId w:val="2"/>
-        </w:numPr>
-      </w:pPr>
-      <w:r>
-        <w:t>Arhitektura</w:t>
-      </w:r>
-      <w:r>
-        <w:t xml:space="preserve"> koja </w:t>
-      </w:r>
-      <w:r>
-        <w:t xml:space="preserve">u stvarnom vremenu </w:t>
-      </w:r>
-      <w:r>
-        <w:t xml:space="preserve">koristi </w:t>
-      </w:r>
-      <w:proofErr w:type="spellStart"/>
-      <w:r>
-        <w:t>WebSocket</w:t>
-      </w:r>
-      <w:proofErr w:type="spellEnd"/>
-      <w:r>
-        <w:t xml:space="preserve"> veze za komunikaciju i prijenos podataka te trajn</w:t>
-      </w:r>
-      <w:r>
-        <w:t>u</w:t>
-      </w:r>
-      <w:r>
-        <w:t xml:space="preserve"> pohran</w:t>
-      </w:r>
-      <w:r>
-        <w:t>u</w:t>
-      </w:r>
-      <w:r>
-        <w:t xml:space="preserve"> u </w:t>
-      </w:r>
-      <w:proofErr w:type="spellStart"/>
-      <w:r>
-        <w:t>PostgreSQL</w:t>
-      </w:r>
-      <w:proofErr w:type="spellEnd"/>
-      <w:r>
-        <w:t xml:space="preserve"> </w:t>
-      </w:r>
-      <w:r>
-        <w:t>bazi podataka</w:t>
-      </w:r>
-      <w:r>
-        <w:t>.</w:t>
-      </w:r>
-    </w:p>
-    <w:p>
-      <w:pPr>
-        <w:pStyle w:val="Odlomakpopisa"/>
-        <w:numPr>
-          <w:ilvl w:val="0"/>
-          <w:numId w:val="2"/>
-        </w:numPr>
-      </w:pPr>
-      <w:r>
-        <w:t xml:space="preserve">Implementacija poslužitelja u Node.js okruženju </w:t>
-      </w:r>
-      <w:r>
-        <w:t>koji koristi</w:t>
-      </w:r>
-      <w:r>
-        <w:t xml:space="preserve"> autentifikaci</w:t>
-      </w:r>
-      <w:r>
-        <w:t>ju</w:t>
-      </w:r>
-      <w:r>
-        <w:t xml:space="preserve"> temeljenu</w:t>
-      </w:r>
-      <w:r>
-        <w:t xml:space="preserve"> </w:t>
-      </w:r>
-      <w:r>
-        <w:t xml:space="preserve">na JWT-u i </w:t>
-      </w:r>
-      <w:r>
-        <w:t>koji upravlja treninzima</w:t>
-      </w:r>
-      <w:r>
-        <w:t>.</w:t>
-      </w:r>
-    </w:p>
-    <w:p>
-      <w:pPr>
-        <w:pStyle w:val="Odlomakpopisa"/>
-        <w:numPr>
-          <w:ilvl w:val="0"/>
-          <w:numId w:val="2"/>
-        </w:numPr>
-      </w:pPr>
-      <w:r>
-        <w:t>Web i mobilno sučelje</w:t>
-      </w:r>
-      <w:r>
-        <w:t xml:space="preserve"> za vizualizaciju treninga uživo i statistikom nakon treninga</w:t>
-      </w:r>
-      <w:r>
-        <w:t>.</w:t>
-      </w:r>
-    </w:p>
-    <w:p>
-      <w:pPr>
-        <w:pStyle w:val="Odlomakpopisa"/>
-        <w:numPr>
-          <w:ilvl w:val="0"/>
-          <w:numId w:val="2"/>
-        </w:numPr>
-      </w:pPr>
-      <w:r>
-        <w:lastRenderedPageBreak/>
-        <w:t>Prilagodljivi algoritam za detekciju udarca temeljen na algoritmu otkrivanja vrhova (</w:t>
-      </w:r>
-      <w:proofErr w:type="spellStart"/>
-      <w:r>
-        <w:t>Finding</w:t>
-      </w:r>
-      <w:proofErr w:type="spellEnd"/>
-      <w:r>
-        <w:t xml:space="preserve"> </w:t>
-      </w:r>
-      <w:proofErr w:type="spellStart"/>
-      <w:r>
-        <w:t>peaks</w:t>
-      </w:r>
-      <w:proofErr w:type="spellEnd"/>
-      <w:r>
-        <w:t xml:space="preserve"> </w:t>
-      </w:r>
-      <w:proofErr w:type="spellStart"/>
-      <w:r>
-        <w:t>algorithm</w:t>
-      </w:r>
-      <w:proofErr w:type="spellEnd"/>
-      <w:r>
-        <w:t>)</w:t>
-      </w:r>
-      <w:r>
-        <w:t>, prikladan za šumovite signale koje generira vreća za udaranje.</w:t>
+        <w:t xml:space="preserve"> bazu te klijentsku aplikaciju s naprednim statističkim prikazom koja računa metrike udaraca, pokazatelje zamora korisnika, serije udaraca i usporedbe napretka.</w:t>
       </w:r>
     </w:p>
     <w:p>
@@ -2264,42 +2247,200 @@
       <w:pPr>
         <w:pStyle w:val="Naslov1"/>
       </w:pPr>
-      <w:bookmarkStart w:id="1" w:name="_Toc229765530"/>
+      <w:bookmarkStart w:id="2" w:name="_Toc230097432"/>
       <w:r>
         <w:lastRenderedPageBreak/>
-        <w:t>Povezani radovi</w:t>
-      </w:r>
-      <w:bookmarkEnd w:id="1"/>
+        <w:t>Arhitektura i dizajn sustava</w:t>
+      </w:r>
+      <w:bookmarkEnd w:id="2"/>
     </w:p>
     <w:p>
       <w:pPr>
         <w:ind w:firstLine="432"/>
       </w:pPr>
       <w:r>
-        <w:t>Istraživa</w:t>
-      </w:r>
-      <w:r>
-        <w:t>čka</w:t>
-      </w:r>
-      <w:r>
-        <w:t xml:space="preserve"> i komercijalna rješenja za praćenje</w:t>
-      </w:r>
-      <w:r>
-        <w:t xml:space="preserve"> statistike udaraca u borilačkim sportovima obično se dijele u tri kategorije</w:t>
-      </w:r>
-      <w:r>
-        <w:t xml:space="preserve">: mete/vreće s ugrađenim senzorima, nosivi senzori (rukavice, narukvice) i </w:t>
-      </w:r>
-      <w:r>
-        <w:t xml:space="preserve">hibridni sustavi koji kombiniraju više različitih senzorskih uređaja. </w:t>
-      </w:r>
-    </w:p>
+        <w:t xml:space="preserve">Sustav za praćenje i analizu statistike treninga na vreći za udaranje temelji se na klijent-poslužiteljskoj arhitekturi proširenoj s ugrađenim senzorskim sustavom. Takav pristup omogućuje jasnu podjelu odgovornosti, modularnost, skalabilnost i jednostavnu nadogradnju sustava za više korisnika i uređaja. </w:t>
+      </w:r>
+      <w:r>
+        <w:t xml:space="preserve">Sustav se sastoji od tri glavne komponente: senzorski sustav (ESP32-S3), poslužitelj (Node.js) i </w:t>
+      </w:r>
+      <w:r>
+        <w:t>Web klijent (</w:t>
+      </w:r>
+      <w:proofErr w:type="spellStart"/>
+      <w:r>
+        <w:t>React</w:t>
+      </w:r>
+      <w:proofErr w:type="spellEnd"/>
+      <w:r>
+        <w:t xml:space="preserve"> </w:t>
+      </w:r>
+      <w:proofErr w:type="spellStart"/>
+      <w:r>
+        <w:t>Native</w:t>
+      </w:r>
+      <w:proofErr w:type="spellEnd"/>
+      <w:r>
+        <w:t>/</w:t>
+      </w:r>
+      <w:proofErr w:type="spellStart"/>
+      <w:r>
+        <w:t>React</w:t>
+      </w:r>
+      <w:proofErr w:type="spellEnd"/>
+      <w:r>
+        <w:t xml:space="preserve"> Vite).</w:t>
+      </w:r>
+    </w:p>
+    <w:p>
+      <w:pPr>
+        <w:pStyle w:val="Naslov2"/>
+      </w:pPr>
+      <w:bookmarkStart w:id="3" w:name="_Toc230097433"/>
+      <w:r>
+        <w:t>Glavne komponente sustava</w:t>
+      </w:r>
+      <w:bookmarkEnd w:id="3"/>
+    </w:p>
+    <w:p>
+      <w:pPr>
+        <w:ind w:firstLine="432"/>
+      </w:pPr>
+      <w:r>
+        <w:t xml:space="preserve">Senzorski sustav (ESP32-S3) opremljen je s Wi-Fi modulom koji mu omogućuje povezivanje s mrežom i razmjenu podataka s poslužiteljem </w:t>
+      </w:r>
+      <w:r>
+        <w:t xml:space="preserve">putem </w:t>
+      </w:r>
+      <w:proofErr w:type="spellStart"/>
+      <w:r>
+        <w:t>WebSocket</w:t>
+      </w:r>
+      <w:proofErr w:type="spellEnd"/>
+      <w:r>
+        <w:t xml:space="preserve"> veza. Na njemu su ugrađena dva </w:t>
+      </w:r>
+      <w:proofErr w:type="spellStart"/>
+      <w:r>
+        <w:t>akcelerometra</w:t>
+      </w:r>
+      <w:proofErr w:type="spellEnd"/>
+      <w:r>
+        <w:t xml:space="preserve"> (LIS3DH), koji su smješteni na vrhu i dnu vreće te su </w:t>
+      </w:r>
+      <w:proofErr w:type="spellStart"/>
+      <w:r>
+        <w:t>konfigurani</w:t>
+      </w:r>
+      <w:proofErr w:type="spellEnd"/>
+      <w:r>
+        <w:t xml:space="preserve"> na 200 Hz i </w:t>
+      </w:r>
+      <w:r>
+        <w:t>±</w:t>
+      </w:r>
+      <w:r>
+        <w:t xml:space="preserve"> 16 g. Na početku rada senzora provodi se inicijalno uzorkovanje radi izračuna početne vrijednosti. Tijekom aktivne sesije senzor kontinuirano šalje sinkronizirane mjerne podatke u intervalu od oko 5 </w:t>
+      </w:r>
+      <w:proofErr w:type="spellStart"/>
+      <w:r>
+        <w:t>ms</w:t>
+      </w:r>
+      <w:proofErr w:type="spellEnd"/>
+      <w:r>
+        <w:t xml:space="preserve"> (~200 Hz) što omogućuje precizno praćenje svakog udarca i stanja vreće. </w:t>
+      </w:r>
+    </w:p>
+    <w:p>
+      <w:pPr>
+        <w:ind w:firstLine="432"/>
+      </w:pPr>
+      <w:r>
+        <w:t>Poslužitelj (Node.js) je glavna središnja komponenta koja upravlja svim korisničkim podatcima i</w:t>
+      </w:r>
+      <w:r>
+        <w:t xml:space="preserve"> treninzima</w:t>
+      </w:r>
+      <w:r>
+        <w:t xml:space="preserve">, autentifikacijom </w:t>
+      </w:r>
+      <w:r>
+        <w:t xml:space="preserve">te validacijom i pohranom podataka u </w:t>
+      </w:r>
+      <w:proofErr w:type="spellStart"/>
+      <w:r>
+        <w:t>PostgreSQL</w:t>
+      </w:r>
+      <w:proofErr w:type="spellEnd"/>
+      <w:r>
+        <w:t xml:space="preserve"> bazu. </w:t>
+      </w:r>
+      <w:r>
+        <w:t>Zadu</w:t>
+      </w:r>
+      <w:r>
+        <w:t>žen je za spremanje podataka sa senzora u bazu podatka te prosljeđivanjem podataka o treninzima prema klijentu</w:t>
+      </w:r>
+      <w:r>
+        <w:t>, na zahtjev klijenta na poslužitelju se određeni treninzi brišu u cijelosti ili samo određeni podatci sa senzora</w:t>
+      </w:r>
+      <w:r>
+        <w:t xml:space="preserve">. </w:t>
+      </w:r>
+    </w:p>
+    <w:p>
+      <w:pPr>
+        <w:ind w:firstLine="432"/>
+      </w:pPr>
+      <w:r>
+        <w:t>Web klijent predstavlja</w:t>
+      </w:r>
+      <w:r>
+        <w:t xml:space="preserve"> korisničko sučelje putem kojeg se odvija autentifikacija, pokretanje i praćenje treninga te pregled vizualizacija i analiza nakon treninga. </w:t>
+      </w:r>
+      <w:r>
+        <w:t>Sučelje omogućuje prikaz grafikona i detaljnih statistika (broj udaraca, sila udarca, distribucija udaraca u vremenu…)</w:t>
+      </w:r>
+      <w:r>
+        <w:t xml:space="preserve"> te usporedbu podataka s prethodnih treninga. Dizajn klijenta usmjeren je na </w:t>
+      </w:r>
+      <w:proofErr w:type="spellStart"/>
+      <w:r>
+        <w:t>responzivnost</w:t>
+      </w:r>
+      <w:proofErr w:type="spellEnd"/>
+      <w:r>
+        <w:t xml:space="preserve"> i </w:t>
+      </w:r>
+      <w:proofErr w:type="spellStart"/>
+      <w:r>
+        <w:t>jansoću</w:t>
+      </w:r>
+      <w:proofErr w:type="spellEnd"/>
+      <w:r>
+        <w:t xml:space="preserve"> prikaza, kako bi se korisnicima omogućio brz i pregledan uvid u njihov napredak. </w:t>
+      </w:r>
+    </w:p>
+    <w:p>
+      <w:pPr>
+        <w:pStyle w:val="Naslov2"/>
+      </w:pPr>
+      <w:bookmarkStart w:id="4" w:name="_Toc230097434"/>
+      <w:r>
+        <w:t>Komunikacija i protok podataka</w:t>
+      </w:r>
+      <w:bookmarkEnd w:id="4"/>
+    </w:p>
+    <w:p/>
+    <w:p/>
+    <w:p/>
     <w:p>
       <w:pPr>
         <w:spacing w:line="278" w:lineRule="auto"/>
         <w:jc w:val="left"/>
       </w:pPr>
       <w:r>
+        <w:lastRenderedPageBreak/>
         <w:br w:type="page"/>
       </w:r>
     </w:p>
@@ -2307,12 +2448,12 @@
       <w:pPr>
         <w:pStyle w:val="Naslov1"/>
       </w:pPr>
-      <w:bookmarkStart w:id="2" w:name="_Toc229765531"/>
+      <w:bookmarkStart w:id="5" w:name="_Toc230097435"/>
       <w:r>
         <w:lastRenderedPageBreak/>
-        <w:t>Pregled sustava i arhitektura</w:t>
-      </w:r>
-      <w:bookmarkEnd w:id="2"/>
+        <w:t>Ugradbeni senzorski čvor (ESP32)</w:t>
+      </w:r>
+      <w:bookmarkEnd w:id="5"/>
     </w:p>
     <w:p>
       <w:pPr>
@@ -2327,12 +2468,65 @@
       <w:pPr>
         <w:pStyle w:val="Naslov1"/>
       </w:pPr>
-      <w:bookmarkStart w:id="3" w:name="_Toc229765532"/>
+      <w:bookmarkStart w:id="6" w:name="_Toc230097436"/>
       <w:r>
         <w:lastRenderedPageBreak/>
-        <w:t>Ugradbeni senzorski čvor (ESP32)</w:t>
-      </w:r>
-      <w:bookmarkEnd w:id="3"/>
+        <w:t xml:space="preserve">Implementacija pozadinskog sustava (Node.js + </w:t>
+      </w:r>
+      <w:proofErr w:type="spellStart"/>
+      <w:r>
+        <w:t>PostgreSQL</w:t>
+      </w:r>
+      <w:proofErr w:type="spellEnd"/>
+      <w:r>
+        <w:t>)</w:t>
+      </w:r>
+      <w:bookmarkEnd w:id="6"/>
+    </w:p>
+    <w:p>
+      <w:pPr>
+        <w:pStyle w:val="Naslov2"/>
+      </w:pPr>
+      <w:bookmarkStart w:id="7" w:name="_Toc230097437"/>
+      <w:proofErr w:type="spellStart"/>
+      <w:r>
+        <w:t>WebSocket</w:t>
+      </w:r>
+      <w:proofErr w:type="spellEnd"/>
+      <w:r>
+        <w:t xml:space="preserve"> i uloge klijenta</w:t>
+      </w:r>
+      <w:bookmarkEnd w:id="7"/>
+    </w:p>
+    <w:p>
+      <w:pPr>
+        <w:pStyle w:val="Naslov2"/>
+      </w:pPr>
+      <w:bookmarkStart w:id="8" w:name="_Toc230097438"/>
+      <w:r>
+        <w:t>Uparivanje skeniranjem QR koda i životni ciklus sesije</w:t>
+      </w:r>
+      <w:bookmarkEnd w:id="8"/>
+    </w:p>
+    <w:p>
+      <w:pPr>
+        <w:pStyle w:val="Naslov2"/>
+      </w:pPr>
+      <w:bookmarkStart w:id="9" w:name="_Toc230097439"/>
+      <w:r>
+        <w:t>Prikupljanje i pohrana mjerenja u stvarnom vremenu</w:t>
+      </w:r>
+      <w:bookmarkEnd w:id="9"/>
+    </w:p>
+    <w:p>
+      <w:pPr>
+        <w:pStyle w:val="Naslov2"/>
+      </w:pPr>
+      <w:bookmarkStart w:id="10" w:name="_Toc230097440"/>
+      <w:r>
+        <w:t>Upravljanje podacima</w:t>
+      </w:r>
+      <w:bookmarkEnd w:id="10"/>
     </w:p>
     <w:p>
       <w:pPr>
@@ -2347,65 +2541,32 @@
       <w:pPr>
         <w:pStyle w:val="Naslov1"/>
       </w:pPr>
-      <w:bookmarkStart w:id="4" w:name="_Toc229765533"/>
+      <w:bookmarkStart w:id="11" w:name="_Toc230097441"/>
       <w:r>
         <w:lastRenderedPageBreak/>
-        <w:t xml:space="preserve">Implementacija pozadinskog sustava (Node.js + </w:t>
-      </w:r>
-      <w:proofErr w:type="spellStart"/>
-      <w:r>
-        <w:t>PostgreSQL</w:t>
-      </w:r>
-      <w:proofErr w:type="spellEnd"/>
-      <w:r>
-        <w:t>)</w:t>
-      </w:r>
-      <w:bookmarkEnd w:id="4"/>
+        <w:t>Implementacija korisničkog sučelja (web i mobilna)</w:t>
+      </w:r>
+      <w:bookmarkEnd w:id="11"/>
     </w:p>
     <w:p>
       <w:pPr>
         <w:pStyle w:val="Naslov2"/>
       </w:pPr>
-      <w:bookmarkStart w:id="5" w:name="_Toc229765534"/>
-      <w:proofErr w:type="spellStart"/>
-      <w:r>
-        <w:t>WebSocket</w:t>
-      </w:r>
-      <w:proofErr w:type="spellEnd"/>
-      <w:r>
-        <w:t xml:space="preserve"> i uloge klijenta</w:t>
-      </w:r>
-      <w:bookmarkEnd w:id="5"/>
+      <w:bookmarkStart w:id="12" w:name="_Toc230097442"/>
+      <w:r>
+        <w:t>Uparivanje i pokretanje sesije putem QR koda</w:t>
+      </w:r>
+      <w:bookmarkEnd w:id="12"/>
     </w:p>
     <w:p>
       <w:pPr>
         <w:pStyle w:val="Naslov2"/>
       </w:pPr>
-      <w:bookmarkStart w:id="6" w:name="_Toc229765535"/>
-      <w:r>
-        <w:t>Uparivanje skeniranjem QR koda i životni ciklus sesije</w:t>
-      </w:r>
-      <w:bookmarkEnd w:id="6"/>
-    </w:p>
-    <w:p>
-      <w:pPr>
-        <w:pStyle w:val="Naslov2"/>
-      </w:pPr>
-      <w:bookmarkStart w:id="7" w:name="_Toc229765536"/>
-      <w:r>
-        <w:t>Prikupljanje i pohrana mjerenja u stvarnom vremenu</w:t>
-      </w:r>
-      <w:bookmarkEnd w:id="7"/>
-    </w:p>
-    <w:p>
-      <w:pPr>
-        <w:pStyle w:val="Naslov2"/>
-      </w:pPr>
-      <w:bookmarkStart w:id="8" w:name="_Toc229765537"/>
-      <w:r>
-        <w:t>Upravljanje podacima</w:t>
-      </w:r>
-      <w:bookmarkEnd w:id="8"/>
+      <w:bookmarkStart w:id="13" w:name="_Toc230097443"/>
+      <w:r>
+        <w:t>Statistika sesije</w:t>
+      </w:r>
+      <w:bookmarkEnd w:id="13"/>
     </w:p>
     <w:p>
       <w:pPr>
@@ -2420,32 +2581,22 @@
       <w:pPr>
         <w:pStyle w:val="Naslov1"/>
       </w:pPr>
-      <w:bookmarkStart w:id="9" w:name="_Toc229765538"/>
+      <w:bookmarkStart w:id="14" w:name="_Toc230097444"/>
       <w:r>
         <w:lastRenderedPageBreak/>
-        <w:t>Implementacija korisničkog sučelja (web i mobilna)</w:t>
-      </w:r>
-      <w:bookmarkEnd w:id="9"/>
+        <w:t>Detekcija udarca i procesiranje signala</w:t>
+      </w:r>
+      <w:bookmarkEnd w:id="14"/>
     </w:p>
     <w:p>
       <w:pPr>
         <w:pStyle w:val="Naslov2"/>
       </w:pPr>
-      <w:bookmarkStart w:id="10" w:name="_Toc229765539"/>
-      <w:r>
-        <w:t>Uparivanje i pokretanje sesije putem QR koda</w:t>
-      </w:r>
-      <w:bookmarkEnd w:id="10"/>
-    </w:p>
-    <w:p>
-      <w:pPr>
-        <w:pStyle w:val="Naslov2"/>
-      </w:pPr>
-      <w:bookmarkStart w:id="11" w:name="_Toc229765540"/>
-      <w:r>
-        <w:t>Statistika sesije</w:t>
-      </w:r>
-      <w:bookmarkEnd w:id="11"/>
+      <w:bookmarkStart w:id="15" w:name="_Toc230097445"/>
+      <w:r>
+        <w:t>Procjena sile (izvor i jednadžba)</w:t>
+      </w:r>
+      <w:bookmarkEnd w:id="15"/>
     </w:p>
     <w:p>
       <w:pPr>
@@ -2460,42 +2611,12 @@
       <w:pPr>
         <w:pStyle w:val="Naslov1"/>
       </w:pPr>
-      <w:bookmarkStart w:id="12" w:name="_Toc229765541"/>
-      <w:r>
-        <w:lastRenderedPageBreak/>
-        <w:t>Detekcija udarca i procesiranje signala</w:t>
-      </w:r>
-      <w:bookmarkEnd w:id="12"/>
-    </w:p>
-    <w:p>
-      <w:pPr>
-        <w:pStyle w:val="Naslov2"/>
-      </w:pPr>
-      <w:bookmarkStart w:id="13" w:name="_Toc229765542"/>
-      <w:r>
-        <w:t>Procjena sile (izvor i jednadžba)</w:t>
-      </w:r>
-      <w:bookmarkEnd w:id="13"/>
-    </w:p>
-    <w:p>
-      <w:pPr>
-        <w:spacing w:line="278" w:lineRule="auto"/>
-        <w:jc w:val="left"/>
-      </w:pPr>
-      <w:r>
-        <w:br w:type="page"/>
-      </w:r>
-    </w:p>
-    <w:p>
-      <w:pPr>
-        <w:pStyle w:val="Naslov1"/>
-      </w:pPr>
-      <w:bookmarkStart w:id="14" w:name="_Toc229765543"/>
+      <w:bookmarkStart w:id="16" w:name="_Toc230097446"/>
       <w:r>
         <w:lastRenderedPageBreak/>
         <w:t>Rezultati i evaluacija</w:t>
       </w:r>
-      <w:bookmarkEnd w:id="14"/>
+      <w:bookmarkEnd w:id="16"/>
     </w:p>
     <w:p>
       <w:pPr>
@@ -2515,12 +2636,12 @@
         </w:numPr>
         <w:ind w:left="432" w:hanging="432"/>
       </w:pPr>
-      <w:bookmarkStart w:id="15" w:name="_Toc229765544"/>
+      <w:bookmarkStart w:id="17" w:name="_Toc230097447"/>
       <w:r>
         <w:lastRenderedPageBreak/>
         <w:t>Zaključak</w:t>
       </w:r>
-      <w:bookmarkEnd w:id="15"/>
+      <w:bookmarkEnd w:id="17"/>
     </w:p>
     <w:p>
       <w:pPr>
@@ -2531,11 +2652,608 @@
         </w:numPr>
         <w:ind w:left="432" w:hanging="432"/>
       </w:pPr>
-      <w:bookmarkStart w:id="16" w:name="_Toc229765545"/>
+      <w:bookmarkStart w:id="18" w:name="_Toc230097448"/>
       <w:r>
         <w:t>Literatura</w:t>
       </w:r>
-      <w:bookmarkEnd w:id="16"/>
+      <w:bookmarkEnd w:id="18"/>
+    </w:p>
+    <w:p>
+      <w:pPr>
+        <w:pStyle w:val="Odlomakpopisa"/>
+        <w:numPr>
+          <w:ilvl w:val="0"/>
+          <w:numId w:val="4"/>
+        </w:numPr>
+      </w:pPr>
+      <w:r>
+        <w:t xml:space="preserve">A. Vinković, I. </w:t>
+      </w:r>
+      <w:proofErr w:type="spellStart"/>
+      <w:r>
+        <w:t>Linardić</w:t>
+      </w:r>
+      <w:proofErr w:type="spellEnd"/>
+      <w:r>
+        <w:t xml:space="preserve">, D. Meštrović, J. Petrović </w:t>
+      </w:r>
+      <w:proofErr w:type="spellStart"/>
+      <w:r>
+        <w:t>and</w:t>
+      </w:r>
+      <w:proofErr w:type="spellEnd"/>
+      <w:r>
+        <w:t xml:space="preserve"> P. Pale, "An </w:t>
+      </w:r>
+      <w:proofErr w:type="spellStart"/>
+      <w:r>
+        <w:t>interactive</w:t>
+      </w:r>
+      <w:proofErr w:type="spellEnd"/>
+      <w:r>
+        <w:t xml:space="preserve"> </w:t>
+      </w:r>
+      <w:proofErr w:type="spellStart"/>
+      <w:r>
+        <w:t>punch</w:t>
+      </w:r>
+      <w:proofErr w:type="spellEnd"/>
+      <w:r>
+        <w:t xml:space="preserve"> </w:t>
+      </w:r>
+      <w:proofErr w:type="spellStart"/>
+      <w:r>
+        <w:t>power</w:t>
+      </w:r>
+      <w:proofErr w:type="spellEnd"/>
+      <w:r>
+        <w:t xml:space="preserve"> </w:t>
+      </w:r>
+      <w:proofErr w:type="spellStart"/>
+      <w:r>
+        <w:t>tracker</w:t>
+      </w:r>
+      <w:proofErr w:type="spellEnd"/>
+      <w:r>
+        <w:t xml:space="preserve"> for heavy </w:t>
+      </w:r>
+      <w:proofErr w:type="spellStart"/>
+      <w:r>
+        <w:t>bag</w:t>
+      </w:r>
+      <w:proofErr w:type="spellEnd"/>
+      <w:r>
+        <w:t xml:space="preserve"> </w:t>
+      </w:r>
+      <w:proofErr w:type="spellStart"/>
+      <w:r>
+        <w:t>training</w:t>
+      </w:r>
+      <w:proofErr w:type="spellEnd"/>
+      <w:r>
+        <w:t xml:space="preserve">," 2020 43rd International </w:t>
+      </w:r>
+      <w:proofErr w:type="spellStart"/>
+      <w:r>
+        <w:t>Convention</w:t>
+      </w:r>
+      <w:proofErr w:type="spellEnd"/>
+      <w:r>
+        <w:t xml:space="preserve"> on </w:t>
+      </w:r>
+      <w:proofErr w:type="spellStart"/>
+      <w:r>
+        <w:t>Information</w:t>
+      </w:r>
+      <w:proofErr w:type="spellEnd"/>
+      <w:r>
+        <w:t xml:space="preserve">, </w:t>
+      </w:r>
+      <w:proofErr w:type="spellStart"/>
+      <w:r>
+        <w:t>Communication</w:t>
+      </w:r>
+      <w:proofErr w:type="spellEnd"/>
+      <w:r>
+        <w:t xml:space="preserve"> </w:t>
+      </w:r>
+      <w:proofErr w:type="spellStart"/>
+      <w:r>
+        <w:t>and</w:t>
+      </w:r>
+      <w:proofErr w:type="spellEnd"/>
+      <w:r>
+        <w:t xml:space="preserve"> Electronic Technology (MIPRO), Opatija, Croatia, 2020, </w:t>
+      </w:r>
+      <w:proofErr w:type="spellStart"/>
+      <w:r>
+        <w:t>pp</w:t>
+      </w:r>
+      <w:proofErr w:type="spellEnd"/>
+      <w:r>
+        <w:t>. 1716-1719</w:t>
+      </w:r>
+    </w:p>
+    <w:p>
+      <w:pPr>
+        <w:pStyle w:val="Odlomakpopisa"/>
+        <w:numPr>
+          <w:ilvl w:val="0"/>
+          <w:numId w:val="4"/>
+        </w:numPr>
+      </w:pPr>
+      <w:proofErr w:type="spellStart"/>
+      <w:r>
+        <w:t>Buśko</w:t>
+      </w:r>
+      <w:proofErr w:type="spellEnd"/>
+      <w:r>
+        <w:t xml:space="preserve">, </w:t>
+      </w:r>
+      <w:proofErr w:type="spellStart"/>
+      <w:r>
+        <w:t>Krzysztof</w:t>
+      </w:r>
+      <w:proofErr w:type="spellEnd"/>
+      <w:r>
+        <w:t xml:space="preserve"> &amp; </w:t>
+      </w:r>
+      <w:proofErr w:type="spellStart"/>
+      <w:r>
+        <w:t>Staniak</w:t>
+      </w:r>
+      <w:proofErr w:type="spellEnd"/>
+      <w:r>
+        <w:t xml:space="preserve">, </w:t>
+      </w:r>
+      <w:proofErr w:type="spellStart"/>
+      <w:r>
+        <w:t>Zbigniew</w:t>
+      </w:r>
+      <w:proofErr w:type="spellEnd"/>
+      <w:r>
+        <w:t xml:space="preserve"> &amp; </w:t>
+      </w:r>
+      <w:proofErr w:type="spellStart"/>
+      <w:r>
+        <w:t>Szark-Eckardt</w:t>
+      </w:r>
+      <w:proofErr w:type="spellEnd"/>
+      <w:r>
+        <w:t xml:space="preserve">, </w:t>
+      </w:r>
+      <w:proofErr w:type="spellStart"/>
+      <w:r>
+        <w:t>Mirosława</w:t>
+      </w:r>
+      <w:proofErr w:type="spellEnd"/>
+      <w:r>
+        <w:t xml:space="preserve"> &amp; </w:t>
+      </w:r>
+      <w:proofErr w:type="spellStart"/>
+      <w:r>
+        <w:t>Nikolaidis</w:t>
+      </w:r>
+      <w:proofErr w:type="spellEnd"/>
+      <w:r>
+        <w:t xml:space="preserve">, </w:t>
+      </w:r>
+      <w:proofErr w:type="spellStart"/>
+      <w:r>
+        <w:t>Pantelis</w:t>
+      </w:r>
+      <w:proofErr w:type="spellEnd"/>
+      <w:r>
+        <w:t xml:space="preserve"> &amp; </w:t>
+      </w:r>
+      <w:proofErr w:type="spellStart"/>
+      <w:r>
+        <w:t>Mazur-Różycka</w:t>
+      </w:r>
+      <w:proofErr w:type="spellEnd"/>
+      <w:r>
+        <w:t xml:space="preserve">, </w:t>
+      </w:r>
+      <w:proofErr w:type="spellStart"/>
+      <w:r>
+        <w:t>Joanna</w:t>
+      </w:r>
+      <w:proofErr w:type="spellEnd"/>
+      <w:r>
+        <w:t xml:space="preserve"> &amp; </w:t>
+      </w:r>
+      <w:proofErr w:type="spellStart"/>
+      <w:r>
+        <w:t>Łach</w:t>
+      </w:r>
+      <w:proofErr w:type="spellEnd"/>
+      <w:r>
+        <w:t xml:space="preserve">, P. &amp; </w:t>
+      </w:r>
+      <w:proofErr w:type="spellStart"/>
+      <w:r>
+        <w:t>Michalski</w:t>
+      </w:r>
+      <w:proofErr w:type="spellEnd"/>
+      <w:r>
+        <w:t xml:space="preserve">, </w:t>
+      </w:r>
+      <w:proofErr w:type="spellStart"/>
+      <w:r>
+        <w:t>Radosław</w:t>
+      </w:r>
+      <w:proofErr w:type="spellEnd"/>
+      <w:r>
+        <w:t xml:space="preserve"> &amp; </w:t>
+      </w:r>
+      <w:proofErr w:type="spellStart"/>
+      <w:r>
+        <w:t>Gajewski</w:t>
+      </w:r>
+      <w:proofErr w:type="spellEnd"/>
+      <w:r>
+        <w:t xml:space="preserve">, Jan &amp; Górski, </w:t>
+      </w:r>
+      <w:proofErr w:type="spellStart"/>
+      <w:r>
+        <w:t>Michał</w:t>
+      </w:r>
+      <w:proofErr w:type="spellEnd"/>
+      <w:r>
+        <w:t xml:space="preserve">. (2016). </w:t>
+      </w:r>
+      <w:proofErr w:type="spellStart"/>
+      <w:r>
+        <w:t>Measuring</w:t>
+      </w:r>
+      <w:proofErr w:type="spellEnd"/>
+      <w:r>
+        <w:t xml:space="preserve"> </w:t>
+      </w:r>
+      <w:proofErr w:type="spellStart"/>
+      <w:r>
+        <w:t>the</w:t>
+      </w:r>
+      <w:proofErr w:type="spellEnd"/>
+      <w:r>
+        <w:t xml:space="preserve"> </w:t>
+      </w:r>
+      <w:proofErr w:type="spellStart"/>
+      <w:r>
+        <w:t>force</w:t>
+      </w:r>
+      <w:proofErr w:type="spellEnd"/>
+      <w:r>
+        <w:t xml:space="preserve"> </w:t>
+      </w:r>
+      <w:proofErr w:type="spellStart"/>
+      <w:r>
+        <w:t>of</w:t>
+      </w:r>
+      <w:proofErr w:type="spellEnd"/>
+      <w:r>
+        <w:t xml:space="preserve"> </w:t>
+      </w:r>
+      <w:proofErr w:type="spellStart"/>
+      <w:r>
+        <w:t>punches</w:t>
+      </w:r>
+      <w:proofErr w:type="spellEnd"/>
+      <w:r>
+        <w:t xml:space="preserve"> </w:t>
+      </w:r>
+      <w:proofErr w:type="spellStart"/>
+      <w:r>
+        <w:t>and</w:t>
+      </w:r>
+      <w:proofErr w:type="spellEnd"/>
+      <w:r>
+        <w:t xml:space="preserve"> </w:t>
+      </w:r>
+      <w:proofErr w:type="spellStart"/>
+      <w:r>
+        <w:t>kicks</w:t>
+      </w:r>
+      <w:proofErr w:type="spellEnd"/>
+      <w:r>
+        <w:t xml:space="preserve"> </w:t>
+      </w:r>
+      <w:proofErr w:type="spellStart"/>
+      <w:r>
+        <w:t>among</w:t>
+      </w:r>
+      <w:proofErr w:type="spellEnd"/>
+      <w:r>
+        <w:t xml:space="preserve"> </w:t>
+      </w:r>
+      <w:proofErr w:type="spellStart"/>
+      <w:r>
+        <w:t>combat</w:t>
+      </w:r>
+      <w:proofErr w:type="spellEnd"/>
+      <w:r>
+        <w:t xml:space="preserve"> sport </w:t>
+      </w:r>
+      <w:proofErr w:type="spellStart"/>
+      <w:r>
+        <w:t>athletes</w:t>
+      </w:r>
+      <w:proofErr w:type="spellEnd"/>
+      <w:r>
+        <w:t xml:space="preserve"> </w:t>
+      </w:r>
+      <w:proofErr w:type="spellStart"/>
+      <w:r>
+        <w:t>using</w:t>
+      </w:r>
+      <w:proofErr w:type="spellEnd"/>
+      <w:r>
+        <w:t xml:space="preserve"> a </w:t>
+      </w:r>
+      <w:proofErr w:type="spellStart"/>
+      <w:r>
+        <w:t>modified</w:t>
+      </w:r>
+      <w:proofErr w:type="spellEnd"/>
+      <w:r>
+        <w:t xml:space="preserve"> </w:t>
+      </w:r>
+      <w:proofErr w:type="spellStart"/>
+      <w:r>
+        <w:t>punching</w:t>
+      </w:r>
+      <w:proofErr w:type="spellEnd"/>
+      <w:r>
+        <w:t xml:space="preserve"> </w:t>
+      </w:r>
+      <w:proofErr w:type="spellStart"/>
+      <w:r>
+        <w:t>bag</w:t>
+      </w:r>
+      <w:proofErr w:type="spellEnd"/>
+      <w:r>
+        <w:t xml:space="preserve"> </w:t>
+      </w:r>
+      <w:proofErr w:type="spellStart"/>
+      <w:r>
+        <w:t>with</w:t>
+      </w:r>
+      <w:proofErr w:type="spellEnd"/>
+      <w:r>
+        <w:t xml:space="preserve"> </w:t>
+      </w:r>
+      <w:proofErr w:type="spellStart"/>
+      <w:r>
+        <w:t>an</w:t>
+      </w:r>
+      <w:proofErr w:type="spellEnd"/>
+      <w:r>
+        <w:t xml:space="preserve"> </w:t>
+      </w:r>
+      <w:proofErr w:type="spellStart"/>
+      <w:r>
+        <w:t>embedded</w:t>
+      </w:r>
+      <w:proofErr w:type="spellEnd"/>
+      <w:r>
+        <w:t xml:space="preserve"> </w:t>
+      </w:r>
+      <w:proofErr w:type="spellStart"/>
+      <w:r>
+        <w:t>accelerometer</w:t>
+      </w:r>
+      <w:proofErr w:type="spellEnd"/>
+      <w:r>
+        <w:t>. 18. 47-54. 10.5277/ABB-00304-2015-02.</w:t>
+      </w:r>
+    </w:p>
+    <w:p>
+      <w:pPr>
+        <w:pStyle w:val="Odlomakpopisa"/>
+        <w:numPr>
+          <w:ilvl w:val="0"/>
+          <w:numId w:val="4"/>
+        </w:numPr>
+      </w:pPr>
+      <w:proofErr w:type="spellStart"/>
+      <w:r>
+        <w:t>Jovanovski</w:t>
+      </w:r>
+      <w:proofErr w:type="spellEnd"/>
+      <w:r>
+        <w:t xml:space="preserve">, A.; </w:t>
+      </w:r>
+      <w:proofErr w:type="spellStart"/>
+      <w:r>
+        <w:t>Stappenbelt</w:t>
+      </w:r>
+      <w:proofErr w:type="spellEnd"/>
+      <w:r>
+        <w:t xml:space="preserve">, B. </w:t>
+      </w:r>
+      <w:proofErr w:type="spellStart"/>
+      <w:r>
+        <w:t>Measuring</w:t>
+      </w:r>
+      <w:proofErr w:type="spellEnd"/>
+      <w:r>
+        <w:t xml:space="preserve"> </w:t>
+      </w:r>
+      <w:proofErr w:type="spellStart"/>
+      <w:r>
+        <w:t>the</w:t>
+      </w:r>
+      <w:proofErr w:type="spellEnd"/>
+      <w:r>
+        <w:t xml:space="preserve"> </w:t>
+      </w:r>
+      <w:proofErr w:type="spellStart"/>
+      <w:r>
+        <w:t>Boxing</w:t>
+      </w:r>
+      <w:proofErr w:type="spellEnd"/>
+      <w:r>
+        <w:t xml:space="preserve"> </w:t>
+      </w:r>
+      <w:proofErr w:type="spellStart"/>
+      <w:r>
+        <w:t>Punch</w:t>
+      </w:r>
+      <w:proofErr w:type="spellEnd"/>
+      <w:r>
+        <w:t xml:space="preserve">: Development </w:t>
+      </w:r>
+      <w:proofErr w:type="spellStart"/>
+      <w:r>
+        <w:t>and</w:t>
+      </w:r>
+      <w:proofErr w:type="spellEnd"/>
+      <w:r>
+        <w:t xml:space="preserve"> </w:t>
+      </w:r>
+      <w:proofErr w:type="spellStart"/>
+      <w:r>
+        <w:t>Calibration</w:t>
+      </w:r>
+      <w:proofErr w:type="spellEnd"/>
+      <w:r>
+        <w:t xml:space="preserve"> </w:t>
+      </w:r>
+      <w:proofErr w:type="spellStart"/>
+      <w:r>
+        <w:t>of</w:t>
+      </w:r>
+      <w:proofErr w:type="spellEnd"/>
+      <w:r>
+        <w:t xml:space="preserve"> a </w:t>
+      </w:r>
+      <w:proofErr w:type="spellStart"/>
+      <w:r>
+        <w:t>Non-Embedded</w:t>
+      </w:r>
+      <w:proofErr w:type="spellEnd"/>
+      <w:r>
+        <w:t xml:space="preserve"> In-</w:t>
+      </w:r>
+      <w:proofErr w:type="spellStart"/>
+      <w:r>
+        <w:t>Glove</w:t>
+      </w:r>
+      <w:proofErr w:type="spellEnd"/>
+      <w:r>
+        <w:t xml:space="preserve"> </w:t>
+      </w:r>
+      <w:proofErr w:type="spellStart"/>
+      <w:r>
+        <w:t>Piezo-Resistive</w:t>
+      </w:r>
+      <w:proofErr w:type="spellEnd"/>
+      <w:r>
+        <w:t xml:space="preserve"> </w:t>
+      </w:r>
+      <w:proofErr w:type="spellStart"/>
+      <w:r>
+        <w:t>Sensor</w:t>
+      </w:r>
+      <w:proofErr w:type="spellEnd"/>
+      <w:r>
+        <w:t xml:space="preserve">. </w:t>
+      </w:r>
+      <w:proofErr w:type="spellStart"/>
+      <w:r>
+        <w:t>Proceedings</w:t>
+      </w:r>
+      <w:proofErr w:type="spellEnd"/>
+      <w:r>
+        <w:t xml:space="preserve"> 2020, 49, 13. </w:t>
+      </w:r>
+      <w:hyperlink r:id="rId6" w:history="1">
+        <w:r>
+          <w:rPr>
+            <w:rStyle w:val="Hiperveza"/>
+          </w:rPr>
+          <w:t>https://doi.org/10.3390/proceedings2020049013</w:t>
+        </w:r>
+      </w:hyperlink>
+      <w:r>
+        <w:t xml:space="preserve"> </w:t>
+      </w:r>
+    </w:p>
+    <w:p>
+      <w:pPr>
+        <w:pStyle w:val="Odlomakpopisa"/>
+        <w:numPr>
+          <w:ilvl w:val="0"/>
+          <w:numId w:val="4"/>
+        </w:numPr>
+      </w:pPr>
+      <w:proofErr w:type="spellStart"/>
+      <w:r>
+        <w:t>PunchLab</w:t>
+      </w:r>
+      <w:proofErr w:type="spellEnd"/>
+      <w:r>
+        <w:t xml:space="preserve"> Poveznica: </w:t>
+      </w:r>
+      <w:hyperlink r:id="rId7" w:history="1">
+        <w:r>
+          <w:rPr>
+            <w:rStyle w:val="Hiperveza"/>
+          </w:rPr>
+          <w:t>https://punchlab.net</w:t>
+        </w:r>
+      </w:hyperlink>
+      <w:r>
+        <w:t xml:space="preserve">; </w:t>
+      </w:r>
+      <w:proofErr w:type="spellStart"/>
+      <w:r>
+        <w:t>pristupljeno</w:t>
+      </w:r>
+      <w:proofErr w:type="spellEnd"/>
+      <w:r>
+        <w:t xml:space="preserve"> 17. svibnja 2026. </w:t>
+      </w:r>
+    </w:p>
+    <w:p>
+      <w:pPr>
+        <w:pStyle w:val="Odlomakpopisa"/>
+        <w:numPr>
+          <w:ilvl w:val="0"/>
+          <w:numId w:val="4"/>
+        </w:numPr>
+      </w:pPr>
+      <w:proofErr w:type="spellStart"/>
+      <w:r>
+        <w:t>FightCamp</w:t>
+      </w:r>
+      <w:proofErr w:type="spellEnd"/>
+      <w:r>
+        <w:t xml:space="preserve"> Poveznica: </w:t>
+      </w:r>
+      <w:r>
+        <w:t>https://joinfightcamp.com/</w:t>
+      </w:r>
+      <w:r>
+        <w:t xml:space="preserve"> ; </w:t>
+      </w:r>
+      <w:proofErr w:type="spellStart"/>
+      <w:r>
+        <w:t>pristupljeno</w:t>
+      </w:r>
+      <w:proofErr w:type="spellEnd"/>
+      <w:r>
+        <w:t>: 17. svibnja 2026.</w:t>
+      </w:r>
+    </w:p>
+    <w:p>
+      <w:pPr>
+        <w:spacing w:line="278" w:lineRule="auto"/>
+        <w:jc w:val="left"/>
+      </w:pPr>
+      <w:r>
+        <w:br w:type="page"/>
+      </w:r>
     </w:p>
     <w:p>
       <w:pPr>
@@ -2546,11 +3264,180 @@
         </w:numPr>
         <w:ind w:left="432" w:hanging="432"/>
       </w:pPr>
-      <w:bookmarkStart w:id="17" w:name="_Toc229765546"/>
-      <w:r>
+      <w:bookmarkStart w:id="19" w:name="_Toc230097449"/>
+      <w:r>
+        <w:lastRenderedPageBreak/>
         <w:t>Sažetak</w:t>
       </w:r>
-      <w:bookmarkEnd w:id="17"/>
+      <w:bookmarkEnd w:id="19"/>
+    </w:p>
+    <w:p>
+      <w:pPr>
+        <w:ind w:firstLine="432"/>
+      </w:pPr>
+      <w:r>
+        <w:t>Digitalna analitika treninga postaje sve važnija u sportu i rekreaciji, čime se omogućuje objektivna povratna informacija i dugoročno praćenje izvedbe treninga. U borilačkim sportovima, treninzi na vreći za udaranje najčešće se procjenjuju subjektivno, dok su mjerljivi pokazatelji poput broja udaraca, raspodjele intenziteta udaraca i usporedbe rezultata dvaju treninga rijetko dostupni bez specijalizirane i skupe opreme</w:t>
+      </w:r>
+      <w:r>
+        <w:t xml:space="preserve"> Također je potreban sustav koji korisniku tijekom treninga omogućuje jednostavno korištenje, neovisno o količini opreme koju nosi.</w:t>
+      </w:r>
+      <w:r>
+        <w:t xml:space="preserve"> To potiče razvoj pristupačnih i proširivih sustava koji mogu prikupljati podatke sa senzora, obrađivati ih u stvarnom vremenu te prikazivati relevantnu statistiku treninga kroz jednostavno korisničko sučelje</w:t>
+      </w:r>
+    </w:p>
+    <w:p>
+      <w:pPr>
+        <w:ind w:firstLine="432"/>
+      </w:pPr>
+      <w:r>
+        <w:t>U ovom radu prikazan je takav web-orijentirani sustav za praćenje, obradu i vizualizaciju podataka treninga na vreći za udaranje u stvarnom vremenu. Rješenje integrira ugradbeni mjerni uređaj (</w:t>
+      </w:r>
+      <w:proofErr w:type="spellStart"/>
+      <w:r>
+        <w:t>akcelerometarske</w:t>
+      </w:r>
+      <w:proofErr w:type="spellEnd"/>
+      <w:r>
+        <w:t xml:space="preserve"> senzore), pozadinski sustav u Node.js okruženju za autentifikaciju, upravljanje sesijama i prijenos podataka, te web i mobilnu aplikaciju koje omogućuju praćenje treninga uživo i analizu podataka nakon treninga. Ugradbeni uređaj šalje izmjerene vrijednosti na poslužitelj putem </w:t>
+      </w:r>
+      <w:proofErr w:type="spellStart"/>
+      <w:r>
+        <w:t>WebSocket</w:t>
+      </w:r>
+      <w:proofErr w:type="spellEnd"/>
+      <w:r>
+        <w:t xml:space="preserve"> veze, što omogućuje dvosmjernu komunikaciju niske latencije za upravljanje treninzima te slanje konfiguracijskih ili ažurirajućih naredbi. Na poslužiteljskoj strani izmjereni podaci, korisnički i sesijski podaci pohranjuju se u </w:t>
+      </w:r>
+      <w:proofErr w:type="spellStart"/>
+      <w:r>
+        <w:t>PostgreSQL</w:t>
+      </w:r>
+      <w:proofErr w:type="spellEnd"/>
+      <w:r>
+        <w:t xml:space="preserve"> bazu podataka. Na korisničkoj strani aplikacija prikazuje grafikone sa jačinom udarca i izračunava metrike treninga (broj udarca, intenzitet udaraca koristeći prilagodljivi algoritam za detekciju udarca), a podatke pohranjuje u lokalnu pohranu (</w:t>
+      </w:r>
+      <w:proofErr w:type="spellStart"/>
+      <w:r>
+        <w:t>Local</w:t>
+      </w:r>
+      <w:proofErr w:type="spellEnd"/>
+      <w:r>
+        <w:t xml:space="preserve"> </w:t>
+      </w:r>
+      <w:proofErr w:type="spellStart"/>
+      <w:r>
+        <w:t>Storage</w:t>
+      </w:r>
+      <w:proofErr w:type="spellEnd"/>
+      <w:r>
+        <w:t xml:space="preserve">) s ciljem smanjenja broja poruka između klijenta i poslužitelja. Za pokretanje sesije koristi se skeniranje QR koda kako bi se olakšalo korištenje korisnicima koji, zbog opreme (rukavice i sl.), ne mogu previše tipkati po uređaju. </w:t>
+      </w:r>
+    </w:p>
+    <w:p>
+      <w:pPr>
+        <w:ind w:firstLine="432"/>
+      </w:pPr>
+      <w:r>
+        <w:t>Glavni doprinosi ovog rada su:</w:t>
+      </w:r>
+    </w:p>
+    <w:p>
+      <w:pPr>
+        <w:pStyle w:val="Odlomakpopisa"/>
+        <w:numPr>
+          <w:ilvl w:val="0"/>
+          <w:numId w:val="2"/>
+        </w:numPr>
+      </w:pPr>
+      <w:r>
+        <w:t xml:space="preserve">Arhitektura koja u stvarnom vremenu koristi </w:t>
+      </w:r>
+      <w:proofErr w:type="spellStart"/>
+      <w:r>
+        <w:t>WebSocket</w:t>
+      </w:r>
+      <w:proofErr w:type="spellEnd"/>
+      <w:r>
+        <w:t xml:space="preserve"> veze za komunikaciju i prijenos podataka te trajnu pohranu u </w:t>
+      </w:r>
+      <w:proofErr w:type="spellStart"/>
+      <w:r>
+        <w:t>PostgreSQL</w:t>
+      </w:r>
+      <w:proofErr w:type="spellEnd"/>
+      <w:r>
+        <w:t xml:space="preserve"> bazi podataka.</w:t>
+      </w:r>
+    </w:p>
+    <w:p>
+      <w:pPr>
+        <w:pStyle w:val="Odlomakpopisa"/>
+        <w:numPr>
+          <w:ilvl w:val="0"/>
+          <w:numId w:val="2"/>
+        </w:numPr>
+      </w:pPr>
+      <w:r>
+        <w:t>Implementacija poslužitelja u Node.js okruženju koji koristi autentifikaciju temeljenu na JWT-u i koji upravlja treninzima.</w:t>
+      </w:r>
+    </w:p>
+    <w:p>
+      <w:pPr>
+        <w:pStyle w:val="Odlomakpopisa"/>
+        <w:numPr>
+          <w:ilvl w:val="0"/>
+          <w:numId w:val="2"/>
+        </w:numPr>
+      </w:pPr>
+      <w:r>
+        <w:t>Web i mobilno sučelje za vizualizaciju treninga uživo i statistikom nakon treninga.</w:t>
+      </w:r>
+    </w:p>
+    <w:p>
+      <w:pPr>
+        <w:pStyle w:val="Odlomakpopisa"/>
+        <w:numPr>
+          <w:ilvl w:val="0"/>
+          <w:numId w:val="2"/>
+        </w:numPr>
+      </w:pPr>
+      <w:r>
+        <w:lastRenderedPageBreak/>
+        <w:t>Prilagodljivi algoritam za detekciju udarca temeljen na algoritmu otkrivanja vrhova (</w:t>
+      </w:r>
+      <w:proofErr w:type="spellStart"/>
+      <w:r>
+        <w:t>Finding</w:t>
+      </w:r>
+      <w:proofErr w:type="spellEnd"/>
+      <w:r>
+        <w:t xml:space="preserve"> </w:t>
+      </w:r>
+      <w:proofErr w:type="spellStart"/>
+      <w:r>
+        <w:t>peaks</w:t>
+      </w:r>
+      <w:proofErr w:type="spellEnd"/>
+      <w:r>
+        <w:t xml:space="preserve"> </w:t>
+      </w:r>
+      <w:proofErr w:type="spellStart"/>
+      <w:r>
+        <w:t>algorithm</w:t>
+      </w:r>
+      <w:proofErr w:type="spellEnd"/>
+      <w:r>
+        <w:t>), prikladan za šumovite signale koje generira vreća za udaranje.</w:t>
+      </w:r>
+    </w:p>
+    <w:p>
+      <w:pPr>
+        <w:spacing w:line="278" w:lineRule="auto"/>
+        <w:jc w:val="left"/>
+      </w:pPr>
+      <w:r>
+        <w:br w:type="page"/>
+      </w:r>
     </w:p>
     <w:p>
       <w:pPr>
@@ -2561,15 +3448,1936 @@
         </w:numPr>
         <w:ind w:left="432" w:hanging="432"/>
       </w:pPr>
-      <w:bookmarkStart w:id="18" w:name="_Toc229765547"/>
-      <w:r>
+      <w:bookmarkStart w:id="20" w:name="_Toc230097450"/>
+      <w:r>
+        <w:lastRenderedPageBreak/>
         <w:t>Summary</w:t>
       </w:r>
-      <w:bookmarkEnd w:id="18"/>
-    </w:p>
-    <w:p/>
-    <w:p/>
-    <w:p/>
+      <w:bookmarkEnd w:id="20"/>
+    </w:p>
+    <w:p>
+      <w:r>
+        <w:tab/>
+      </w:r>
+      <w:r>
+        <w:t xml:space="preserve">Digital </w:t>
+      </w:r>
+      <w:proofErr w:type="spellStart"/>
+      <w:r>
+        <w:t>training</w:t>
+      </w:r>
+      <w:proofErr w:type="spellEnd"/>
+      <w:r>
+        <w:t xml:space="preserve"> </w:t>
+      </w:r>
+      <w:proofErr w:type="spellStart"/>
+      <w:r>
+        <w:t>analytics</w:t>
+      </w:r>
+      <w:proofErr w:type="spellEnd"/>
+      <w:r>
+        <w:t xml:space="preserve"> </w:t>
+      </w:r>
+      <w:proofErr w:type="spellStart"/>
+      <w:r>
+        <w:t>have</w:t>
+      </w:r>
+      <w:proofErr w:type="spellEnd"/>
+      <w:r>
+        <w:t xml:space="preserve"> </w:t>
+      </w:r>
+      <w:proofErr w:type="spellStart"/>
+      <w:r>
+        <w:t>become</w:t>
+      </w:r>
+      <w:proofErr w:type="spellEnd"/>
+      <w:r>
+        <w:t xml:space="preserve"> </w:t>
+      </w:r>
+      <w:proofErr w:type="spellStart"/>
+      <w:r>
+        <w:t>increasingly</w:t>
+      </w:r>
+      <w:proofErr w:type="spellEnd"/>
+      <w:r>
+        <w:t xml:space="preserve"> </w:t>
+      </w:r>
+      <w:proofErr w:type="spellStart"/>
+      <w:r>
+        <w:t>important</w:t>
+      </w:r>
+      <w:proofErr w:type="spellEnd"/>
+      <w:r>
+        <w:t xml:space="preserve"> </w:t>
+      </w:r>
+      <w:proofErr w:type="spellStart"/>
+      <w:r>
+        <w:t>in</w:t>
+      </w:r>
+      <w:proofErr w:type="spellEnd"/>
+      <w:r>
+        <w:t xml:space="preserve"> </w:t>
+      </w:r>
+      <w:proofErr w:type="spellStart"/>
+      <w:r>
+        <w:t>sports</w:t>
+      </w:r>
+      <w:proofErr w:type="spellEnd"/>
+      <w:r>
+        <w:t xml:space="preserve"> </w:t>
+      </w:r>
+      <w:proofErr w:type="spellStart"/>
+      <w:r>
+        <w:t>and</w:t>
+      </w:r>
+      <w:proofErr w:type="spellEnd"/>
+      <w:r>
+        <w:t xml:space="preserve"> fitness, </w:t>
+      </w:r>
+      <w:proofErr w:type="spellStart"/>
+      <w:r>
+        <w:t>enabling</w:t>
+      </w:r>
+      <w:proofErr w:type="spellEnd"/>
+      <w:r>
+        <w:t xml:space="preserve"> </w:t>
+      </w:r>
+      <w:proofErr w:type="spellStart"/>
+      <w:r>
+        <w:t>objective</w:t>
+      </w:r>
+      <w:proofErr w:type="spellEnd"/>
+      <w:r>
+        <w:t xml:space="preserve"> </w:t>
+      </w:r>
+      <w:proofErr w:type="spellStart"/>
+      <w:r>
+        <w:t>feedback</w:t>
+      </w:r>
+      <w:proofErr w:type="spellEnd"/>
+      <w:r>
+        <w:t xml:space="preserve"> </w:t>
+      </w:r>
+      <w:proofErr w:type="spellStart"/>
+      <w:r>
+        <w:t>and</w:t>
+      </w:r>
+      <w:proofErr w:type="spellEnd"/>
+      <w:r>
+        <w:t xml:space="preserve"> </w:t>
+      </w:r>
+      <w:proofErr w:type="spellStart"/>
+      <w:r>
+        <w:t>long-term</w:t>
+      </w:r>
+      <w:proofErr w:type="spellEnd"/>
+      <w:r>
+        <w:t xml:space="preserve"> </w:t>
+      </w:r>
+      <w:proofErr w:type="spellStart"/>
+      <w:r>
+        <w:t>performance</w:t>
+      </w:r>
+      <w:proofErr w:type="spellEnd"/>
+      <w:r>
+        <w:t xml:space="preserve"> </w:t>
+      </w:r>
+      <w:proofErr w:type="spellStart"/>
+      <w:r>
+        <w:t>tracking</w:t>
+      </w:r>
+      <w:proofErr w:type="spellEnd"/>
+      <w:r>
+        <w:t xml:space="preserve">. In </w:t>
+      </w:r>
+      <w:proofErr w:type="spellStart"/>
+      <w:r>
+        <w:t>striking</w:t>
+      </w:r>
+      <w:proofErr w:type="spellEnd"/>
+      <w:r>
+        <w:t xml:space="preserve"> </w:t>
+      </w:r>
+      <w:proofErr w:type="spellStart"/>
+      <w:r>
+        <w:t>sports</w:t>
+      </w:r>
+      <w:proofErr w:type="spellEnd"/>
+      <w:r>
+        <w:t xml:space="preserve">, </w:t>
+      </w:r>
+      <w:proofErr w:type="spellStart"/>
+      <w:r>
+        <w:t>boxing</w:t>
+      </w:r>
+      <w:proofErr w:type="spellEnd"/>
+      <w:r>
+        <w:t xml:space="preserve"> </w:t>
+      </w:r>
+      <w:proofErr w:type="spellStart"/>
+      <w:r>
+        <w:t>bag</w:t>
+      </w:r>
+      <w:proofErr w:type="spellEnd"/>
+      <w:r>
+        <w:t xml:space="preserve"> </w:t>
+      </w:r>
+      <w:proofErr w:type="spellStart"/>
+      <w:r>
+        <w:t>training</w:t>
+      </w:r>
+      <w:proofErr w:type="spellEnd"/>
+      <w:r>
+        <w:t xml:space="preserve"> </w:t>
+      </w:r>
+      <w:proofErr w:type="spellStart"/>
+      <w:r>
+        <w:t>is</w:t>
+      </w:r>
+      <w:proofErr w:type="spellEnd"/>
+      <w:r>
+        <w:t xml:space="preserve"> </w:t>
+      </w:r>
+      <w:proofErr w:type="spellStart"/>
+      <w:r>
+        <w:t>commonly</w:t>
+      </w:r>
+      <w:proofErr w:type="spellEnd"/>
+      <w:r>
+        <w:t xml:space="preserve"> </w:t>
+      </w:r>
+      <w:proofErr w:type="spellStart"/>
+      <w:r>
+        <w:t>evaluated</w:t>
+      </w:r>
+      <w:proofErr w:type="spellEnd"/>
+      <w:r>
+        <w:t xml:space="preserve"> </w:t>
+      </w:r>
+      <w:proofErr w:type="spellStart"/>
+      <w:r>
+        <w:t>subjectively</w:t>
+      </w:r>
+      <w:proofErr w:type="spellEnd"/>
+      <w:r>
+        <w:t xml:space="preserve">, </w:t>
+      </w:r>
+      <w:proofErr w:type="spellStart"/>
+      <w:r>
+        <w:t>while</w:t>
+      </w:r>
+      <w:proofErr w:type="spellEnd"/>
+      <w:r>
+        <w:t xml:space="preserve"> </w:t>
+      </w:r>
+      <w:proofErr w:type="spellStart"/>
+      <w:r>
+        <w:t>meas</w:t>
+      </w:r>
+      <w:r>
+        <w:t>urable</w:t>
+      </w:r>
+      <w:proofErr w:type="spellEnd"/>
+      <w:r>
+        <w:t xml:space="preserve"> </w:t>
+      </w:r>
+      <w:proofErr w:type="spellStart"/>
+      <w:r>
+        <w:t>indicators</w:t>
+      </w:r>
+      <w:proofErr w:type="spellEnd"/>
+      <w:r>
+        <w:t xml:space="preserve"> </w:t>
+      </w:r>
+      <w:proofErr w:type="spellStart"/>
+      <w:r>
+        <w:t>such</w:t>
+      </w:r>
+      <w:proofErr w:type="spellEnd"/>
+      <w:r>
+        <w:t xml:space="preserve"> as </w:t>
+      </w:r>
+      <w:proofErr w:type="spellStart"/>
+      <w:r>
+        <w:t>nuber</w:t>
+      </w:r>
+      <w:proofErr w:type="spellEnd"/>
+      <w:r>
+        <w:t xml:space="preserve"> </w:t>
+      </w:r>
+      <w:proofErr w:type="spellStart"/>
+      <w:r>
+        <w:t>of</w:t>
+      </w:r>
+      <w:proofErr w:type="spellEnd"/>
+      <w:r>
+        <w:t xml:space="preserve"> </w:t>
+      </w:r>
+      <w:proofErr w:type="spellStart"/>
+      <w:r>
+        <w:t>punches</w:t>
+      </w:r>
+      <w:proofErr w:type="spellEnd"/>
+      <w:r>
+        <w:t xml:space="preserve">, </w:t>
+      </w:r>
+      <w:proofErr w:type="spellStart"/>
+      <w:r>
+        <w:t>punch</w:t>
+      </w:r>
+      <w:proofErr w:type="spellEnd"/>
+      <w:r>
+        <w:t xml:space="preserve"> </w:t>
+      </w:r>
+      <w:proofErr w:type="spellStart"/>
+      <w:r>
+        <w:t>intesity</w:t>
+      </w:r>
+      <w:proofErr w:type="spellEnd"/>
+      <w:r>
+        <w:t xml:space="preserve"> </w:t>
+      </w:r>
+      <w:proofErr w:type="spellStart"/>
+      <w:r>
+        <w:t>distribution</w:t>
+      </w:r>
+      <w:proofErr w:type="spellEnd"/>
+      <w:r>
+        <w:t xml:space="preserve">, </w:t>
+      </w:r>
+      <w:proofErr w:type="spellStart"/>
+      <w:r>
+        <w:t>and</w:t>
+      </w:r>
+      <w:proofErr w:type="spellEnd"/>
+      <w:r>
+        <w:t xml:space="preserve"> </w:t>
+      </w:r>
+      <w:proofErr w:type="spellStart"/>
+      <w:r>
+        <w:t>temporal</w:t>
+      </w:r>
+      <w:proofErr w:type="spellEnd"/>
+      <w:r>
+        <w:t xml:space="preserve"> </w:t>
+      </w:r>
+      <w:proofErr w:type="spellStart"/>
+      <w:r>
+        <w:t>dynamics</w:t>
+      </w:r>
+      <w:proofErr w:type="spellEnd"/>
+      <w:r>
+        <w:t xml:space="preserve"> are </w:t>
+      </w:r>
+      <w:proofErr w:type="spellStart"/>
+      <w:r>
+        <w:t>rarely</w:t>
+      </w:r>
+      <w:proofErr w:type="spellEnd"/>
+      <w:r>
+        <w:t xml:space="preserve"> </w:t>
+      </w:r>
+      <w:proofErr w:type="spellStart"/>
+      <w:r>
+        <w:t>available</w:t>
+      </w:r>
+      <w:proofErr w:type="spellEnd"/>
+      <w:r>
+        <w:t xml:space="preserve"> </w:t>
+      </w:r>
+      <w:proofErr w:type="spellStart"/>
+      <w:r>
+        <w:t>without</w:t>
+      </w:r>
+      <w:proofErr w:type="spellEnd"/>
+      <w:r>
+        <w:t xml:space="preserve"> </w:t>
+      </w:r>
+      <w:proofErr w:type="spellStart"/>
+      <w:r>
+        <w:t>specialized</w:t>
+      </w:r>
+      <w:proofErr w:type="spellEnd"/>
+      <w:r>
+        <w:t xml:space="preserve"> </w:t>
+      </w:r>
+      <w:proofErr w:type="spellStart"/>
+      <w:r>
+        <w:t>and</w:t>
+      </w:r>
+      <w:proofErr w:type="spellEnd"/>
+      <w:r>
+        <w:t xml:space="preserve"> </w:t>
+      </w:r>
+      <w:proofErr w:type="spellStart"/>
+      <w:r>
+        <w:t>expensive</w:t>
+      </w:r>
+      <w:proofErr w:type="spellEnd"/>
+      <w:r>
+        <w:t xml:space="preserve"> </w:t>
+      </w:r>
+      <w:proofErr w:type="spellStart"/>
+      <w:r>
+        <w:t>equipment</w:t>
+      </w:r>
+      <w:proofErr w:type="spellEnd"/>
+      <w:r>
+        <w:t xml:space="preserve">. </w:t>
+      </w:r>
+      <w:r>
+        <w:t xml:space="preserve">In development </w:t>
+      </w:r>
+      <w:proofErr w:type="spellStart"/>
+      <w:r>
+        <w:t>it</w:t>
+      </w:r>
+      <w:proofErr w:type="spellEnd"/>
+      <w:r>
+        <w:t xml:space="preserve"> </w:t>
+      </w:r>
+      <w:proofErr w:type="spellStart"/>
+      <w:r>
+        <w:t>is</w:t>
+      </w:r>
+      <w:proofErr w:type="spellEnd"/>
+      <w:r>
+        <w:t xml:space="preserve"> </w:t>
+      </w:r>
+      <w:proofErr w:type="spellStart"/>
+      <w:r>
+        <w:t>also</w:t>
+      </w:r>
+      <w:proofErr w:type="spellEnd"/>
+      <w:r>
+        <w:t xml:space="preserve"> </w:t>
+      </w:r>
+      <w:proofErr w:type="spellStart"/>
+      <w:r>
+        <w:t>important</w:t>
+      </w:r>
+      <w:proofErr w:type="spellEnd"/>
+      <w:r>
+        <w:t xml:space="preserve"> to </w:t>
+      </w:r>
+      <w:r>
+        <w:t xml:space="preserve">make a system </w:t>
+      </w:r>
+      <w:proofErr w:type="spellStart"/>
+      <w:r>
+        <w:t>that</w:t>
+      </w:r>
+      <w:proofErr w:type="spellEnd"/>
+      <w:r>
+        <w:t xml:space="preserve"> </w:t>
+      </w:r>
+      <w:proofErr w:type="spellStart"/>
+      <w:r>
+        <w:t>is</w:t>
+      </w:r>
+      <w:proofErr w:type="spellEnd"/>
+      <w:r>
+        <w:t xml:space="preserve"> </w:t>
+      </w:r>
+      <w:proofErr w:type="spellStart"/>
+      <w:r>
+        <w:t>easy</w:t>
+      </w:r>
+      <w:proofErr w:type="spellEnd"/>
+      <w:r>
+        <w:t xml:space="preserve"> to use no </w:t>
+      </w:r>
+      <w:proofErr w:type="spellStart"/>
+      <w:r>
+        <w:t>matter</w:t>
+      </w:r>
+      <w:proofErr w:type="spellEnd"/>
+      <w:r>
+        <w:t xml:space="preserve"> how </w:t>
+      </w:r>
+      <w:proofErr w:type="spellStart"/>
+      <w:r>
+        <w:t>much</w:t>
+      </w:r>
+      <w:proofErr w:type="spellEnd"/>
+      <w:r>
+        <w:t xml:space="preserve"> </w:t>
+      </w:r>
+      <w:proofErr w:type="spellStart"/>
+      <w:r>
+        <w:t>of</w:t>
+      </w:r>
+      <w:proofErr w:type="spellEnd"/>
+      <w:r>
+        <w:t xml:space="preserve"> </w:t>
+      </w:r>
+      <w:proofErr w:type="spellStart"/>
+      <w:r>
+        <w:t>equipment</w:t>
+      </w:r>
+      <w:proofErr w:type="spellEnd"/>
+      <w:r>
+        <w:t xml:space="preserve"> </w:t>
+      </w:r>
+      <w:proofErr w:type="spellStart"/>
+      <w:r>
+        <w:t>the</w:t>
+      </w:r>
+      <w:proofErr w:type="spellEnd"/>
+      <w:r>
+        <w:t xml:space="preserve"> </w:t>
+      </w:r>
+      <w:proofErr w:type="spellStart"/>
+      <w:r>
+        <w:t>user</w:t>
+      </w:r>
+      <w:proofErr w:type="spellEnd"/>
+      <w:r>
+        <w:t xml:space="preserve"> </w:t>
+      </w:r>
+      <w:proofErr w:type="spellStart"/>
+      <w:r>
+        <w:t>wears</w:t>
+      </w:r>
+      <w:proofErr w:type="spellEnd"/>
+      <w:r>
+        <w:t xml:space="preserve"> (</w:t>
+      </w:r>
+      <w:proofErr w:type="spellStart"/>
+      <w:r>
+        <w:t>glowes</w:t>
+      </w:r>
+      <w:proofErr w:type="spellEnd"/>
+      <w:r>
+        <w:t xml:space="preserve"> </w:t>
+      </w:r>
+      <w:proofErr w:type="spellStart"/>
+      <w:r>
+        <w:t>and</w:t>
+      </w:r>
+      <w:proofErr w:type="spellEnd"/>
+      <w:r>
+        <w:t xml:space="preserve"> </w:t>
+      </w:r>
+      <w:proofErr w:type="spellStart"/>
+      <w:r>
+        <w:t>simmilar</w:t>
+      </w:r>
+      <w:proofErr w:type="spellEnd"/>
+      <w:r>
+        <w:t xml:space="preserve"> </w:t>
+      </w:r>
+      <w:proofErr w:type="spellStart"/>
+      <w:r>
+        <w:t>equipment</w:t>
+      </w:r>
+      <w:proofErr w:type="spellEnd"/>
+      <w:r>
+        <w:t xml:space="preserve">). </w:t>
+      </w:r>
+      <w:proofErr w:type="spellStart"/>
+      <w:r>
+        <w:t>This</w:t>
+      </w:r>
+      <w:proofErr w:type="spellEnd"/>
+      <w:r>
+        <w:t xml:space="preserve"> </w:t>
+      </w:r>
+      <w:proofErr w:type="spellStart"/>
+      <w:r>
+        <w:t>motivates</w:t>
+      </w:r>
+      <w:proofErr w:type="spellEnd"/>
+      <w:r>
+        <w:t xml:space="preserve"> developm</w:t>
+      </w:r>
+      <w:r>
+        <w:t xml:space="preserve">ent </w:t>
+      </w:r>
+      <w:proofErr w:type="spellStart"/>
+      <w:r>
+        <w:t>of</w:t>
+      </w:r>
+      <w:proofErr w:type="spellEnd"/>
+      <w:r>
+        <w:t xml:space="preserve"> </w:t>
+      </w:r>
+      <w:proofErr w:type="spellStart"/>
+      <w:r>
+        <w:t>affordable</w:t>
+      </w:r>
+      <w:proofErr w:type="spellEnd"/>
+      <w:r>
+        <w:t xml:space="preserve"> </w:t>
+      </w:r>
+      <w:proofErr w:type="spellStart"/>
+      <w:r>
+        <w:t>and</w:t>
+      </w:r>
+      <w:proofErr w:type="spellEnd"/>
+      <w:r>
+        <w:t xml:space="preserve"> </w:t>
+      </w:r>
+      <w:proofErr w:type="spellStart"/>
+      <w:r>
+        <w:t>extensible</w:t>
+      </w:r>
+      <w:proofErr w:type="spellEnd"/>
+      <w:r>
+        <w:t xml:space="preserve"> </w:t>
+      </w:r>
+      <w:proofErr w:type="spellStart"/>
+      <w:r>
+        <w:t>systems</w:t>
+      </w:r>
+      <w:proofErr w:type="spellEnd"/>
+      <w:r>
+        <w:t xml:space="preserve"> </w:t>
+      </w:r>
+      <w:proofErr w:type="spellStart"/>
+      <w:r>
+        <w:t>that</w:t>
+      </w:r>
+      <w:proofErr w:type="spellEnd"/>
+      <w:r>
+        <w:t xml:space="preserve"> </w:t>
+      </w:r>
+      <w:proofErr w:type="spellStart"/>
+      <w:r>
+        <w:t>can</w:t>
+      </w:r>
+      <w:proofErr w:type="spellEnd"/>
+      <w:r>
+        <w:t xml:space="preserve"> </w:t>
+      </w:r>
+      <w:proofErr w:type="spellStart"/>
+      <w:r>
+        <w:t>collect</w:t>
+      </w:r>
+      <w:proofErr w:type="spellEnd"/>
+      <w:r>
+        <w:t xml:space="preserve"> </w:t>
+      </w:r>
+      <w:proofErr w:type="spellStart"/>
+      <w:r>
+        <w:t>sensor</w:t>
+      </w:r>
+      <w:proofErr w:type="spellEnd"/>
+      <w:r>
+        <w:t xml:space="preserve"> data, </w:t>
+      </w:r>
+      <w:proofErr w:type="spellStart"/>
+      <w:r>
+        <w:t>process</w:t>
+      </w:r>
+      <w:proofErr w:type="spellEnd"/>
+      <w:r>
+        <w:t xml:space="preserve"> </w:t>
+      </w:r>
+      <w:proofErr w:type="spellStart"/>
+      <w:r>
+        <w:t>it</w:t>
+      </w:r>
+      <w:proofErr w:type="spellEnd"/>
+      <w:r>
+        <w:t xml:space="preserve"> </w:t>
+      </w:r>
+      <w:proofErr w:type="spellStart"/>
+      <w:r>
+        <w:t>in</w:t>
+      </w:r>
+      <w:proofErr w:type="spellEnd"/>
+      <w:r>
+        <w:t xml:space="preserve"> </w:t>
+      </w:r>
+      <w:proofErr w:type="spellStart"/>
+      <w:r>
+        <w:t>real</w:t>
+      </w:r>
+      <w:proofErr w:type="spellEnd"/>
+      <w:r>
+        <w:t xml:space="preserve"> time </w:t>
+      </w:r>
+      <w:proofErr w:type="spellStart"/>
+      <w:r>
+        <w:t>and</w:t>
+      </w:r>
+      <w:proofErr w:type="spellEnd"/>
+      <w:r>
+        <w:t xml:space="preserve"> </w:t>
+      </w:r>
+      <w:proofErr w:type="spellStart"/>
+      <w:r>
+        <w:t>present</w:t>
+      </w:r>
+      <w:proofErr w:type="spellEnd"/>
+      <w:r>
+        <w:t xml:space="preserve"> </w:t>
+      </w:r>
+      <w:proofErr w:type="spellStart"/>
+      <w:r>
+        <w:t>meaningful</w:t>
+      </w:r>
+      <w:proofErr w:type="spellEnd"/>
+      <w:r>
+        <w:t xml:space="preserve"> </w:t>
+      </w:r>
+      <w:proofErr w:type="spellStart"/>
+      <w:r>
+        <w:t>training</w:t>
+      </w:r>
+      <w:proofErr w:type="spellEnd"/>
+      <w:r>
+        <w:t xml:space="preserve"> </w:t>
+      </w:r>
+      <w:proofErr w:type="spellStart"/>
+      <w:r>
+        <w:t>statistics</w:t>
+      </w:r>
+      <w:proofErr w:type="spellEnd"/>
+      <w:r>
+        <w:t xml:space="preserve"> </w:t>
+      </w:r>
+      <w:proofErr w:type="spellStart"/>
+      <w:r>
+        <w:t>through</w:t>
+      </w:r>
+      <w:proofErr w:type="spellEnd"/>
+      <w:r>
+        <w:t xml:space="preserve"> </w:t>
+      </w:r>
+      <w:proofErr w:type="spellStart"/>
+      <w:r>
+        <w:t>an</w:t>
+      </w:r>
+      <w:proofErr w:type="spellEnd"/>
+      <w:r>
+        <w:t xml:space="preserve"> </w:t>
+      </w:r>
+      <w:proofErr w:type="spellStart"/>
+      <w:r>
+        <w:t>accesible</w:t>
+      </w:r>
+      <w:proofErr w:type="spellEnd"/>
+      <w:r>
+        <w:t xml:space="preserve"> </w:t>
+      </w:r>
+      <w:proofErr w:type="spellStart"/>
+      <w:r>
+        <w:t>user</w:t>
+      </w:r>
+      <w:proofErr w:type="spellEnd"/>
+      <w:r>
+        <w:t xml:space="preserve"> interface</w:t>
+      </w:r>
+      <w:r>
+        <w:t>.</w:t>
+      </w:r>
+    </w:p>
+    <w:p>
+      <w:r>
+        <w:tab/>
+      </w:r>
+      <w:proofErr w:type="spellStart"/>
+      <w:r>
+        <w:t>This</w:t>
+      </w:r>
+      <w:proofErr w:type="spellEnd"/>
+      <w:r>
+        <w:t xml:space="preserve"> </w:t>
+      </w:r>
+      <w:proofErr w:type="spellStart"/>
+      <w:r>
+        <w:t>paper</w:t>
+      </w:r>
+      <w:proofErr w:type="spellEnd"/>
+      <w:r>
+        <w:t xml:space="preserve"> </w:t>
+      </w:r>
+      <w:proofErr w:type="spellStart"/>
+      <w:r>
+        <w:t>describes</w:t>
+      </w:r>
+      <w:proofErr w:type="spellEnd"/>
+      <w:r>
+        <w:t xml:space="preserve"> </w:t>
+      </w:r>
+      <w:proofErr w:type="spellStart"/>
+      <w:r>
+        <w:t>such</w:t>
+      </w:r>
+      <w:proofErr w:type="spellEnd"/>
+      <w:r>
+        <w:t xml:space="preserve"> web-</w:t>
+      </w:r>
+      <w:proofErr w:type="spellStart"/>
+      <w:r>
+        <w:t>focused</w:t>
+      </w:r>
+      <w:proofErr w:type="spellEnd"/>
+      <w:r>
+        <w:t xml:space="preserve"> system for </w:t>
+      </w:r>
+      <w:proofErr w:type="spellStart"/>
+      <w:r>
+        <w:t>real</w:t>
+      </w:r>
+      <w:proofErr w:type="spellEnd"/>
+      <w:r>
+        <w:t xml:space="preserve"> time </w:t>
+      </w:r>
+      <w:proofErr w:type="spellStart"/>
+      <w:r>
+        <w:t>tracking</w:t>
+      </w:r>
+      <w:proofErr w:type="spellEnd"/>
+      <w:r>
+        <w:t xml:space="preserve">, processing </w:t>
+      </w:r>
+      <w:proofErr w:type="spellStart"/>
+      <w:r>
+        <w:t>and</w:t>
+      </w:r>
+      <w:proofErr w:type="spellEnd"/>
+      <w:r>
+        <w:t xml:space="preserve"> </w:t>
+      </w:r>
+      <w:proofErr w:type="spellStart"/>
+      <w:r>
+        <w:t>visualization</w:t>
+      </w:r>
+      <w:proofErr w:type="spellEnd"/>
+      <w:r>
+        <w:t xml:space="preserve"> </w:t>
+      </w:r>
+      <w:proofErr w:type="spellStart"/>
+      <w:r>
+        <w:t>of</w:t>
+      </w:r>
+      <w:proofErr w:type="spellEnd"/>
+      <w:r>
+        <w:t xml:space="preserve"> </w:t>
+      </w:r>
+      <w:proofErr w:type="spellStart"/>
+      <w:r>
+        <w:t>boxing</w:t>
+      </w:r>
+      <w:proofErr w:type="spellEnd"/>
+      <w:r>
+        <w:t xml:space="preserve"> </w:t>
+      </w:r>
+      <w:proofErr w:type="spellStart"/>
+      <w:r>
+        <w:t>bag</w:t>
+      </w:r>
+      <w:proofErr w:type="spellEnd"/>
+      <w:r>
+        <w:t xml:space="preserve"> </w:t>
+      </w:r>
+      <w:proofErr w:type="spellStart"/>
+      <w:r>
+        <w:t>training</w:t>
+      </w:r>
+      <w:proofErr w:type="spellEnd"/>
+      <w:r>
+        <w:t xml:space="preserve"> dana. </w:t>
+      </w:r>
+      <w:proofErr w:type="spellStart"/>
+      <w:r>
+        <w:t>The</w:t>
+      </w:r>
+      <w:proofErr w:type="spellEnd"/>
+      <w:r>
+        <w:t xml:space="preserve"> </w:t>
+      </w:r>
+      <w:proofErr w:type="spellStart"/>
+      <w:r>
+        <w:t>solution</w:t>
+      </w:r>
+      <w:proofErr w:type="spellEnd"/>
+      <w:r>
+        <w:t xml:space="preserve"> </w:t>
+      </w:r>
+      <w:proofErr w:type="spellStart"/>
+      <w:r>
+        <w:t>integrates</w:t>
+      </w:r>
+      <w:proofErr w:type="spellEnd"/>
+      <w:r>
+        <w:t xml:space="preserve"> </w:t>
+      </w:r>
+      <w:proofErr w:type="spellStart"/>
+      <w:r>
+        <w:t>an</w:t>
+      </w:r>
+      <w:proofErr w:type="spellEnd"/>
+      <w:r>
+        <w:t xml:space="preserve"> </w:t>
+      </w:r>
+      <w:proofErr w:type="spellStart"/>
+      <w:r>
+        <w:t>embedded</w:t>
+      </w:r>
+      <w:proofErr w:type="spellEnd"/>
+      <w:r>
+        <w:t xml:space="preserve"> </w:t>
+      </w:r>
+      <w:proofErr w:type="spellStart"/>
+      <w:r>
+        <w:t>measurment</w:t>
+      </w:r>
+      <w:proofErr w:type="spellEnd"/>
+      <w:r>
+        <w:t xml:space="preserve"> </w:t>
+      </w:r>
+      <w:proofErr w:type="spellStart"/>
+      <w:r>
+        <w:t>device</w:t>
+      </w:r>
+      <w:proofErr w:type="spellEnd"/>
+      <w:r>
+        <w:t xml:space="preserve"> (</w:t>
+      </w:r>
+      <w:proofErr w:type="spellStart"/>
+      <w:r>
+        <w:t>acceleration</w:t>
+      </w:r>
+      <w:proofErr w:type="spellEnd"/>
+      <w:r>
+        <w:t xml:space="preserve"> </w:t>
+      </w:r>
+      <w:proofErr w:type="spellStart"/>
+      <w:r>
+        <w:t>sensors</w:t>
+      </w:r>
+      <w:proofErr w:type="spellEnd"/>
+      <w:r>
+        <w:t xml:space="preserve">), a Node.js </w:t>
+      </w:r>
+      <w:proofErr w:type="spellStart"/>
+      <w:r>
+        <w:t>backend</w:t>
+      </w:r>
+      <w:proofErr w:type="spellEnd"/>
+      <w:r>
+        <w:t xml:space="preserve"> </w:t>
+      </w:r>
+      <w:proofErr w:type="spellStart"/>
+      <w:r>
+        <w:t>responsible</w:t>
+      </w:r>
+      <w:proofErr w:type="spellEnd"/>
+      <w:r>
+        <w:t xml:space="preserve"> for </w:t>
+      </w:r>
+      <w:proofErr w:type="spellStart"/>
+      <w:r>
+        <w:t>authentication</w:t>
+      </w:r>
+      <w:proofErr w:type="spellEnd"/>
+      <w:r>
+        <w:t xml:space="preserve">, </w:t>
+      </w:r>
+      <w:proofErr w:type="spellStart"/>
+      <w:r>
+        <w:t>session</w:t>
+      </w:r>
+      <w:proofErr w:type="spellEnd"/>
+      <w:r>
+        <w:t xml:space="preserve"> </w:t>
+      </w:r>
+      <w:proofErr w:type="spellStart"/>
+      <w:r>
+        <w:t>managment</w:t>
+      </w:r>
+      <w:proofErr w:type="spellEnd"/>
+      <w:r>
+        <w:t xml:space="preserve"> </w:t>
+      </w:r>
+      <w:proofErr w:type="spellStart"/>
+      <w:r>
+        <w:t>and</w:t>
+      </w:r>
+      <w:proofErr w:type="spellEnd"/>
+      <w:r>
+        <w:t xml:space="preserve"> dana transfer, a web </w:t>
+      </w:r>
+      <w:proofErr w:type="spellStart"/>
+      <w:r>
+        <w:t>and</w:t>
+      </w:r>
+      <w:proofErr w:type="spellEnd"/>
+      <w:r>
+        <w:t xml:space="preserve"> </w:t>
+      </w:r>
+      <w:proofErr w:type="spellStart"/>
+      <w:r>
+        <w:t>mobile</w:t>
+      </w:r>
+      <w:proofErr w:type="spellEnd"/>
+      <w:r>
+        <w:t xml:space="preserve"> </w:t>
+      </w:r>
+      <w:proofErr w:type="spellStart"/>
+      <w:r>
+        <w:t>applictaions</w:t>
+      </w:r>
+      <w:proofErr w:type="spellEnd"/>
+      <w:r>
+        <w:t xml:space="preserve"> </w:t>
+      </w:r>
+      <w:proofErr w:type="spellStart"/>
+      <w:r>
+        <w:t>that</w:t>
+      </w:r>
+      <w:proofErr w:type="spellEnd"/>
+      <w:r>
+        <w:t xml:space="preserve"> provide</w:t>
+      </w:r>
+      <w:r>
+        <w:t xml:space="preserve"> live monitoring </w:t>
+      </w:r>
+      <w:proofErr w:type="spellStart"/>
+      <w:r>
+        <w:t>and</w:t>
+      </w:r>
+      <w:proofErr w:type="spellEnd"/>
+      <w:r>
+        <w:t xml:space="preserve"> post-</w:t>
+      </w:r>
+      <w:proofErr w:type="spellStart"/>
+      <w:r>
+        <w:t>training</w:t>
+      </w:r>
+      <w:proofErr w:type="spellEnd"/>
+      <w:r>
+        <w:t xml:space="preserve"> </w:t>
+      </w:r>
+      <w:proofErr w:type="spellStart"/>
+      <w:r>
+        <w:t>analytics</w:t>
+      </w:r>
+      <w:proofErr w:type="spellEnd"/>
+      <w:r>
+        <w:t xml:space="preserve">. </w:t>
+      </w:r>
+      <w:proofErr w:type="spellStart"/>
+      <w:r>
+        <w:t>The</w:t>
+      </w:r>
+      <w:proofErr w:type="spellEnd"/>
+      <w:r>
+        <w:t xml:space="preserve"> </w:t>
+      </w:r>
+      <w:proofErr w:type="spellStart"/>
+      <w:r>
+        <w:t>embedded</w:t>
+      </w:r>
+      <w:proofErr w:type="spellEnd"/>
+      <w:r>
+        <w:t xml:space="preserve"> </w:t>
+      </w:r>
+      <w:proofErr w:type="spellStart"/>
+      <w:r>
+        <w:t>device</w:t>
+      </w:r>
+      <w:proofErr w:type="spellEnd"/>
+      <w:r>
+        <w:t xml:space="preserve"> </w:t>
+      </w:r>
+      <w:proofErr w:type="spellStart"/>
+      <w:r>
+        <w:t>streams</w:t>
+      </w:r>
+      <w:proofErr w:type="spellEnd"/>
+      <w:r>
+        <w:t xml:space="preserve"> </w:t>
+      </w:r>
+      <w:proofErr w:type="spellStart"/>
+      <w:r>
+        <w:t>measurments</w:t>
+      </w:r>
+      <w:proofErr w:type="spellEnd"/>
+      <w:r>
+        <w:t xml:space="preserve"> to </w:t>
+      </w:r>
+      <w:proofErr w:type="spellStart"/>
+      <w:r>
+        <w:t>the</w:t>
+      </w:r>
+      <w:proofErr w:type="spellEnd"/>
+      <w:r>
+        <w:t xml:space="preserve"> server via </w:t>
+      </w:r>
+      <w:proofErr w:type="spellStart"/>
+      <w:r>
+        <w:t>WebSocket</w:t>
+      </w:r>
+      <w:proofErr w:type="spellEnd"/>
+      <w:r>
+        <w:t xml:space="preserve">, </w:t>
+      </w:r>
+      <w:proofErr w:type="spellStart"/>
+      <w:r>
+        <w:t>enabling</w:t>
+      </w:r>
+      <w:proofErr w:type="spellEnd"/>
+      <w:r>
+        <w:t xml:space="preserve"> </w:t>
+      </w:r>
+      <w:proofErr w:type="spellStart"/>
+      <w:r>
+        <w:t>low-latency</w:t>
+      </w:r>
+      <w:proofErr w:type="spellEnd"/>
+      <w:r>
+        <w:t xml:space="preserve"> </w:t>
+      </w:r>
+      <w:proofErr w:type="spellStart"/>
+      <w:r>
+        <w:t>bidirectional</w:t>
+      </w:r>
+      <w:proofErr w:type="spellEnd"/>
+      <w:r>
+        <w:t xml:space="preserve"> </w:t>
+      </w:r>
+      <w:proofErr w:type="spellStart"/>
+      <w:r>
+        <w:t>communication</w:t>
+      </w:r>
+      <w:proofErr w:type="spellEnd"/>
+      <w:r>
+        <w:t xml:space="preserve"> for </w:t>
+      </w:r>
+      <w:proofErr w:type="spellStart"/>
+      <w:r>
+        <w:t>controlling</w:t>
+      </w:r>
+      <w:proofErr w:type="spellEnd"/>
+      <w:r>
+        <w:t xml:space="preserve"> </w:t>
+      </w:r>
+      <w:proofErr w:type="spellStart"/>
+      <w:r>
+        <w:t>training</w:t>
+      </w:r>
+      <w:proofErr w:type="spellEnd"/>
+      <w:r>
+        <w:t xml:space="preserve"> </w:t>
+      </w:r>
+      <w:proofErr w:type="spellStart"/>
+      <w:r>
+        <w:t>sessions</w:t>
+      </w:r>
+      <w:proofErr w:type="spellEnd"/>
+      <w:r>
+        <w:t xml:space="preserve"> </w:t>
+      </w:r>
+      <w:proofErr w:type="spellStart"/>
+      <w:r>
+        <w:t>and</w:t>
+      </w:r>
+      <w:proofErr w:type="spellEnd"/>
+      <w:r>
+        <w:t xml:space="preserve"> </w:t>
+      </w:r>
+      <w:proofErr w:type="spellStart"/>
+      <w:r>
+        <w:t>delivering</w:t>
+      </w:r>
+      <w:proofErr w:type="spellEnd"/>
+      <w:r>
+        <w:t xml:space="preserve"> </w:t>
+      </w:r>
+      <w:proofErr w:type="spellStart"/>
+      <w:r>
+        <w:t>configuration</w:t>
+      </w:r>
+      <w:proofErr w:type="spellEnd"/>
+      <w:r>
+        <w:t xml:space="preserve"> </w:t>
+      </w:r>
+      <w:proofErr w:type="spellStart"/>
+      <w:r>
+        <w:t>or</w:t>
+      </w:r>
+      <w:proofErr w:type="spellEnd"/>
+      <w:r>
+        <w:t xml:space="preserve"> </w:t>
+      </w:r>
+      <w:proofErr w:type="spellStart"/>
+      <w:r>
+        <w:t>update</w:t>
+      </w:r>
+      <w:proofErr w:type="spellEnd"/>
+      <w:r>
+        <w:t xml:space="preserve"> </w:t>
+      </w:r>
+      <w:proofErr w:type="spellStart"/>
+      <w:r>
+        <w:t>commands</w:t>
+      </w:r>
+      <w:proofErr w:type="spellEnd"/>
+      <w:r>
+        <w:t xml:space="preserve">. On </w:t>
+      </w:r>
+      <w:proofErr w:type="spellStart"/>
+      <w:r>
+        <w:t>the</w:t>
+      </w:r>
+      <w:proofErr w:type="spellEnd"/>
+      <w:r>
+        <w:t xml:space="preserve"> server side, </w:t>
+      </w:r>
+      <w:proofErr w:type="spellStart"/>
+      <w:r>
+        <w:t>measurments</w:t>
+      </w:r>
+      <w:proofErr w:type="spellEnd"/>
+      <w:r>
+        <w:t xml:space="preserve">, </w:t>
+      </w:r>
+      <w:proofErr w:type="spellStart"/>
+      <w:r>
+        <w:t>user</w:t>
+      </w:r>
+      <w:proofErr w:type="spellEnd"/>
+      <w:r>
+        <w:t xml:space="preserve"> dana </w:t>
+      </w:r>
+      <w:proofErr w:type="spellStart"/>
+      <w:r>
+        <w:t>and</w:t>
+      </w:r>
+      <w:proofErr w:type="spellEnd"/>
+      <w:r>
+        <w:t xml:space="preserve"> </w:t>
+      </w:r>
+      <w:proofErr w:type="spellStart"/>
+      <w:r>
+        <w:t>session</w:t>
+      </w:r>
+      <w:proofErr w:type="spellEnd"/>
+      <w:r>
+        <w:t xml:space="preserve"> dana are </w:t>
+      </w:r>
+      <w:proofErr w:type="spellStart"/>
+      <w:r>
+        <w:t>stored</w:t>
+      </w:r>
+      <w:proofErr w:type="spellEnd"/>
+      <w:r>
+        <w:t xml:space="preserve"> </w:t>
+      </w:r>
+      <w:proofErr w:type="spellStart"/>
+      <w:r>
+        <w:t>in</w:t>
+      </w:r>
+      <w:proofErr w:type="spellEnd"/>
+      <w:r>
+        <w:t xml:space="preserve"> a </w:t>
+      </w:r>
+      <w:proofErr w:type="spellStart"/>
+      <w:r>
+        <w:t>PostgreSQL</w:t>
+      </w:r>
+      <w:proofErr w:type="spellEnd"/>
+      <w:r>
+        <w:t xml:space="preserve"> </w:t>
+      </w:r>
+      <w:proofErr w:type="spellStart"/>
+      <w:r>
+        <w:t>database</w:t>
+      </w:r>
+      <w:proofErr w:type="spellEnd"/>
+      <w:r>
+        <w:t xml:space="preserve">. On </w:t>
+      </w:r>
+      <w:proofErr w:type="spellStart"/>
+      <w:r>
+        <w:t>the</w:t>
+      </w:r>
+      <w:proofErr w:type="spellEnd"/>
+      <w:r>
+        <w:t xml:space="preserve"> </w:t>
+      </w:r>
+      <w:proofErr w:type="spellStart"/>
+      <w:r>
+        <w:t>client</w:t>
+      </w:r>
+      <w:proofErr w:type="spellEnd"/>
+      <w:r>
+        <w:t xml:space="preserve"> side, </w:t>
+      </w:r>
+      <w:proofErr w:type="spellStart"/>
+      <w:r>
+        <w:t>the</w:t>
+      </w:r>
+      <w:proofErr w:type="spellEnd"/>
+      <w:r>
+        <w:t xml:space="preserve"> </w:t>
+      </w:r>
+      <w:proofErr w:type="spellStart"/>
+      <w:r>
+        <w:t>application</w:t>
+      </w:r>
+      <w:proofErr w:type="spellEnd"/>
+      <w:r>
+        <w:t xml:space="preserve"> </w:t>
+      </w:r>
+      <w:proofErr w:type="spellStart"/>
+      <w:r>
+        <w:t>renders</w:t>
+      </w:r>
+      <w:proofErr w:type="spellEnd"/>
+      <w:r>
+        <w:t xml:space="preserve"> time-</w:t>
+      </w:r>
+      <w:proofErr w:type="spellStart"/>
+      <w:r>
+        <w:t>series</w:t>
+      </w:r>
+      <w:proofErr w:type="spellEnd"/>
+      <w:r>
+        <w:t xml:space="preserve"> </w:t>
+      </w:r>
+      <w:proofErr w:type="spellStart"/>
+      <w:r>
+        <w:t>charts</w:t>
+      </w:r>
+      <w:proofErr w:type="spellEnd"/>
+      <w:r>
+        <w:t xml:space="preserve"> </w:t>
+      </w:r>
+      <w:proofErr w:type="spellStart"/>
+      <w:r>
+        <w:t>and</w:t>
+      </w:r>
+      <w:proofErr w:type="spellEnd"/>
+      <w:r>
+        <w:t xml:space="preserve"> </w:t>
+      </w:r>
+      <w:proofErr w:type="spellStart"/>
+      <w:r>
+        <w:t>calculates</w:t>
+      </w:r>
+      <w:proofErr w:type="spellEnd"/>
+      <w:r>
+        <w:t xml:space="preserve"> </w:t>
+      </w:r>
+      <w:proofErr w:type="spellStart"/>
+      <w:r>
+        <w:t>training</w:t>
+      </w:r>
+      <w:proofErr w:type="spellEnd"/>
+      <w:r>
+        <w:t xml:space="preserve"> </w:t>
+      </w:r>
+      <w:proofErr w:type="spellStart"/>
+      <w:r>
+        <w:t>metrics</w:t>
+      </w:r>
+      <w:proofErr w:type="spellEnd"/>
+      <w:r>
+        <w:t xml:space="preserve"> </w:t>
+      </w:r>
+      <w:proofErr w:type="spellStart"/>
+      <w:r>
+        <w:t>such</w:t>
+      </w:r>
+      <w:proofErr w:type="spellEnd"/>
+      <w:r>
+        <w:t xml:space="preserve"> as </w:t>
+      </w:r>
+      <w:proofErr w:type="spellStart"/>
+      <w:r>
+        <w:t>punch</w:t>
+      </w:r>
+      <w:proofErr w:type="spellEnd"/>
+      <w:r>
+        <w:t xml:space="preserve"> </w:t>
+      </w:r>
+      <w:proofErr w:type="spellStart"/>
+      <w:r>
+        <w:t>count</w:t>
+      </w:r>
+      <w:proofErr w:type="spellEnd"/>
+      <w:r>
+        <w:t xml:space="preserve"> </w:t>
+      </w:r>
+      <w:proofErr w:type="spellStart"/>
+      <w:r>
+        <w:t>and</w:t>
+      </w:r>
+      <w:proofErr w:type="spellEnd"/>
+      <w:r>
+        <w:t xml:space="preserve"> </w:t>
+      </w:r>
+      <w:proofErr w:type="spellStart"/>
+      <w:r>
+        <w:t>intensity</w:t>
+      </w:r>
+      <w:proofErr w:type="spellEnd"/>
+      <w:r>
+        <w:t xml:space="preserve"> </w:t>
+      </w:r>
+      <w:proofErr w:type="spellStart"/>
+      <w:r>
+        <w:t>statiistics</w:t>
+      </w:r>
+      <w:proofErr w:type="spellEnd"/>
+      <w:r>
+        <w:t xml:space="preserve"> </w:t>
+      </w:r>
+      <w:proofErr w:type="spellStart"/>
+      <w:r>
+        <w:t>using</w:t>
+      </w:r>
+      <w:proofErr w:type="spellEnd"/>
+      <w:r>
+        <w:t xml:space="preserve"> a </w:t>
+      </w:r>
+      <w:proofErr w:type="spellStart"/>
+      <w:r>
+        <w:t>configurable</w:t>
+      </w:r>
+      <w:proofErr w:type="spellEnd"/>
+      <w:r>
+        <w:t xml:space="preserve"> hit-</w:t>
+      </w:r>
+      <w:proofErr w:type="spellStart"/>
+      <w:r>
+        <w:t>detection</w:t>
+      </w:r>
+      <w:proofErr w:type="spellEnd"/>
+      <w:r>
+        <w:t xml:space="preserve"> </w:t>
+      </w:r>
+      <w:proofErr w:type="spellStart"/>
+      <w:r>
+        <w:t>algorithm</w:t>
+      </w:r>
+      <w:proofErr w:type="spellEnd"/>
+      <w:r>
+        <w:t xml:space="preserve"> </w:t>
+      </w:r>
+      <w:proofErr w:type="spellStart"/>
+      <w:r>
+        <w:t>and</w:t>
+      </w:r>
+      <w:proofErr w:type="spellEnd"/>
+      <w:r>
+        <w:t xml:space="preserve"> </w:t>
+      </w:r>
+      <w:proofErr w:type="spellStart"/>
+      <w:r>
+        <w:t>stores</w:t>
+      </w:r>
+      <w:proofErr w:type="spellEnd"/>
+      <w:r>
+        <w:t xml:space="preserve"> data </w:t>
+      </w:r>
+      <w:proofErr w:type="spellStart"/>
+      <w:r>
+        <w:t>in</w:t>
+      </w:r>
+      <w:proofErr w:type="spellEnd"/>
+      <w:r>
+        <w:t xml:space="preserve"> </w:t>
+      </w:r>
+      <w:proofErr w:type="spellStart"/>
+      <w:r>
+        <w:t>Local</w:t>
+      </w:r>
+      <w:proofErr w:type="spellEnd"/>
+      <w:r>
+        <w:t xml:space="preserve"> </w:t>
+      </w:r>
+      <w:proofErr w:type="spellStart"/>
+      <w:r>
+        <w:t>Storage</w:t>
+      </w:r>
+      <w:proofErr w:type="spellEnd"/>
+      <w:r>
+        <w:t xml:space="preserve"> to </w:t>
+      </w:r>
+      <w:proofErr w:type="spellStart"/>
+      <w:r>
+        <w:t>desreacse</w:t>
+      </w:r>
+      <w:proofErr w:type="spellEnd"/>
+      <w:r>
+        <w:t xml:space="preserve"> </w:t>
+      </w:r>
+      <w:proofErr w:type="spellStart"/>
+      <w:r>
+        <w:t>the</w:t>
+      </w:r>
+      <w:proofErr w:type="spellEnd"/>
+      <w:r>
+        <w:t xml:space="preserve"> </w:t>
+      </w:r>
+      <w:proofErr w:type="spellStart"/>
+      <w:r>
+        <w:t>number</w:t>
+      </w:r>
+      <w:proofErr w:type="spellEnd"/>
+      <w:r>
+        <w:t xml:space="preserve"> od </w:t>
+      </w:r>
+      <w:proofErr w:type="spellStart"/>
+      <w:r>
+        <w:t>messages</w:t>
+      </w:r>
+      <w:proofErr w:type="spellEnd"/>
+      <w:r>
+        <w:t xml:space="preserve"> </w:t>
+      </w:r>
+      <w:proofErr w:type="spellStart"/>
+      <w:r>
+        <w:t>between</w:t>
+      </w:r>
+      <w:proofErr w:type="spellEnd"/>
+      <w:r>
+        <w:t xml:space="preserve"> </w:t>
+      </w:r>
+      <w:proofErr w:type="spellStart"/>
+      <w:r>
+        <w:t>client</w:t>
+      </w:r>
+      <w:proofErr w:type="spellEnd"/>
+      <w:r>
+        <w:t xml:space="preserve"> </w:t>
+      </w:r>
+      <w:proofErr w:type="spellStart"/>
+      <w:r>
+        <w:t>and</w:t>
+      </w:r>
+      <w:proofErr w:type="spellEnd"/>
+      <w:r>
+        <w:t xml:space="preserve"> server.</w:t>
+      </w:r>
+    </w:p>
+    <w:p>
+      <w:r>
+        <w:tab/>
+      </w:r>
+      <w:proofErr w:type="spellStart"/>
+      <w:r>
+        <w:t>The</w:t>
+      </w:r>
+      <w:proofErr w:type="spellEnd"/>
+      <w:r>
+        <w:t xml:space="preserve"> </w:t>
+      </w:r>
+      <w:proofErr w:type="spellStart"/>
+      <w:r>
+        <w:t>main</w:t>
+      </w:r>
+      <w:proofErr w:type="spellEnd"/>
+      <w:r>
+        <w:t xml:space="preserve"> </w:t>
+      </w:r>
+      <w:proofErr w:type="spellStart"/>
+      <w:r>
+        <w:t>contributions</w:t>
+      </w:r>
+      <w:proofErr w:type="spellEnd"/>
+      <w:r>
+        <w:t xml:space="preserve"> </w:t>
+      </w:r>
+      <w:proofErr w:type="spellStart"/>
+      <w:r>
+        <w:t>of</w:t>
+      </w:r>
+      <w:proofErr w:type="spellEnd"/>
+      <w:r>
+        <w:t xml:space="preserve"> </w:t>
+      </w:r>
+      <w:proofErr w:type="spellStart"/>
+      <w:r>
+        <w:t>this</w:t>
+      </w:r>
+      <w:proofErr w:type="spellEnd"/>
+      <w:r>
+        <w:t xml:space="preserve"> </w:t>
+      </w:r>
+      <w:proofErr w:type="spellStart"/>
+      <w:r>
+        <w:t>work</w:t>
+      </w:r>
+      <w:proofErr w:type="spellEnd"/>
+      <w:r>
+        <w:t xml:space="preserve"> are:</w:t>
+      </w:r>
+    </w:p>
+    <w:p>
+      <w:pPr>
+        <w:pStyle w:val="Odlomakpopisa"/>
+        <w:numPr>
+          <w:ilvl w:val="0"/>
+          <w:numId w:val="5"/>
+        </w:numPr>
+      </w:pPr>
+      <w:r>
+        <w:t xml:space="preserve">A </w:t>
+      </w:r>
+      <w:proofErr w:type="spellStart"/>
+      <w:r>
+        <w:t>practical</w:t>
+      </w:r>
+      <w:proofErr w:type="spellEnd"/>
+      <w:r>
+        <w:t xml:space="preserve"> </w:t>
+      </w:r>
+      <w:proofErr w:type="spellStart"/>
+      <w:r>
+        <w:t>real</w:t>
+      </w:r>
+      <w:proofErr w:type="spellEnd"/>
+      <w:r>
+        <w:t xml:space="preserve">-time </w:t>
+      </w:r>
+      <w:proofErr w:type="spellStart"/>
+      <w:r>
+        <w:t>architecture</w:t>
+      </w:r>
+      <w:proofErr w:type="spellEnd"/>
+      <w:r>
+        <w:t xml:space="preserve"> </w:t>
+      </w:r>
+      <w:proofErr w:type="spellStart"/>
+      <w:r>
+        <w:t>combining</w:t>
+      </w:r>
+      <w:proofErr w:type="spellEnd"/>
+      <w:r>
+        <w:t xml:space="preserve"> </w:t>
+      </w:r>
+      <w:proofErr w:type="spellStart"/>
+      <w:r>
+        <w:t>WebSocket</w:t>
+      </w:r>
+      <w:proofErr w:type="spellEnd"/>
+      <w:r>
+        <w:t xml:space="preserve"> streaming </w:t>
+      </w:r>
+      <w:proofErr w:type="spellStart"/>
+      <w:r>
+        <w:t>with</w:t>
+      </w:r>
+      <w:proofErr w:type="spellEnd"/>
+      <w:r>
+        <w:t xml:space="preserve"> </w:t>
+      </w:r>
+      <w:proofErr w:type="spellStart"/>
+      <w:r>
+        <w:t>persistent</w:t>
+      </w:r>
+      <w:proofErr w:type="spellEnd"/>
+      <w:r>
+        <w:t xml:space="preserve"> </w:t>
+      </w:r>
+      <w:proofErr w:type="spellStart"/>
+      <w:r>
+        <w:t>storage</w:t>
+      </w:r>
+      <w:proofErr w:type="spellEnd"/>
+      <w:r>
+        <w:t xml:space="preserve"> </w:t>
+      </w:r>
+      <w:proofErr w:type="spellStart"/>
+      <w:r>
+        <w:t>in</w:t>
+      </w:r>
+      <w:proofErr w:type="spellEnd"/>
+      <w:r>
+        <w:t xml:space="preserve"> </w:t>
+      </w:r>
+      <w:proofErr w:type="spellStart"/>
+      <w:r>
+        <w:t>PostgreSQL</w:t>
+      </w:r>
+      <w:proofErr w:type="spellEnd"/>
+    </w:p>
+    <w:p>
+      <w:pPr>
+        <w:pStyle w:val="Odlomakpopisa"/>
+        <w:numPr>
+          <w:ilvl w:val="0"/>
+          <w:numId w:val="5"/>
+        </w:numPr>
+      </w:pPr>
+      <w:r>
+        <w:t xml:space="preserve">An </w:t>
+      </w:r>
+      <w:proofErr w:type="spellStart"/>
+      <w:r>
+        <w:t>implementation</w:t>
+      </w:r>
+      <w:proofErr w:type="spellEnd"/>
+      <w:r>
+        <w:t xml:space="preserve"> </w:t>
+      </w:r>
+      <w:proofErr w:type="spellStart"/>
+      <w:r>
+        <w:t>of</w:t>
+      </w:r>
+      <w:proofErr w:type="spellEnd"/>
+      <w:r>
+        <w:t xml:space="preserve"> a Node.js </w:t>
+      </w:r>
+      <w:proofErr w:type="spellStart"/>
+      <w:r>
+        <w:t>backend</w:t>
+      </w:r>
+      <w:proofErr w:type="spellEnd"/>
+      <w:r>
+        <w:t xml:space="preserve"> </w:t>
+      </w:r>
+      <w:proofErr w:type="spellStart"/>
+      <w:r>
+        <w:t>with</w:t>
+      </w:r>
+      <w:proofErr w:type="spellEnd"/>
+      <w:r>
+        <w:t xml:space="preserve"> JWT-</w:t>
+      </w:r>
+      <w:proofErr w:type="spellStart"/>
+      <w:r>
+        <w:t>based</w:t>
+      </w:r>
+      <w:proofErr w:type="spellEnd"/>
+      <w:r>
+        <w:t xml:space="preserve"> </w:t>
+      </w:r>
+      <w:proofErr w:type="spellStart"/>
+      <w:r>
+        <w:t>authentication</w:t>
+      </w:r>
+      <w:proofErr w:type="spellEnd"/>
+      <w:r>
+        <w:t xml:space="preserve"> </w:t>
+      </w:r>
+      <w:proofErr w:type="spellStart"/>
+      <w:r>
+        <w:t>and</w:t>
+      </w:r>
+      <w:proofErr w:type="spellEnd"/>
+      <w:r>
+        <w:t xml:space="preserve"> </w:t>
+      </w:r>
+      <w:proofErr w:type="spellStart"/>
+      <w:r>
+        <w:t>training</w:t>
+      </w:r>
+      <w:proofErr w:type="spellEnd"/>
+      <w:r>
+        <w:t xml:space="preserve"> </w:t>
+      </w:r>
+      <w:proofErr w:type="spellStart"/>
+      <w:r>
+        <w:t>session</w:t>
+      </w:r>
+      <w:proofErr w:type="spellEnd"/>
+      <w:r>
+        <w:t xml:space="preserve"> </w:t>
+      </w:r>
+      <w:proofErr w:type="spellStart"/>
+      <w:r>
+        <w:t>control</w:t>
+      </w:r>
+      <w:proofErr w:type="spellEnd"/>
+    </w:p>
+    <w:p>
+      <w:pPr>
+        <w:pStyle w:val="Odlomakpopisa"/>
+        <w:numPr>
+          <w:ilvl w:val="0"/>
+          <w:numId w:val="5"/>
+        </w:numPr>
+      </w:pPr>
+      <w:r>
+        <w:t xml:space="preserve">A web </w:t>
+      </w:r>
+      <w:proofErr w:type="spellStart"/>
+      <w:r>
+        <w:t>and</w:t>
+      </w:r>
+      <w:proofErr w:type="spellEnd"/>
+      <w:r>
+        <w:t xml:space="preserve"> </w:t>
+      </w:r>
+      <w:proofErr w:type="spellStart"/>
+      <w:r>
+        <w:t>mobile</w:t>
+      </w:r>
+      <w:proofErr w:type="spellEnd"/>
+      <w:r>
+        <w:t xml:space="preserve"> interface for live </w:t>
+      </w:r>
+      <w:proofErr w:type="spellStart"/>
+      <w:r>
+        <w:t>visualization</w:t>
+      </w:r>
+      <w:proofErr w:type="spellEnd"/>
+      <w:r>
+        <w:t xml:space="preserve"> </w:t>
+      </w:r>
+      <w:proofErr w:type="spellStart"/>
+      <w:r>
+        <w:t>and</w:t>
+      </w:r>
+      <w:proofErr w:type="spellEnd"/>
+      <w:r>
+        <w:t xml:space="preserve"> post-</w:t>
+      </w:r>
+      <w:proofErr w:type="spellStart"/>
+      <w:r>
+        <w:t>session</w:t>
+      </w:r>
+      <w:proofErr w:type="spellEnd"/>
+      <w:r>
+        <w:t xml:space="preserve"> </w:t>
+      </w:r>
+      <w:proofErr w:type="spellStart"/>
+      <w:r>
+        <w:t>statistics</w:t>
+      </w:r>
+      <w:proofErr w:type="spellEnd"/>
+      <w:r>
+        <w:t xml:space="preserve">, </w:t>
+      </w:r>
+      <w:proofErr w:type="spellStart"/>
+      <w:r>
+        <w:t>and</w:t>
+      </w:r>
+      <w:proofErr w:type="spellEnd"/>
+    </w:p>
+    <w:p>
+      <w:pPr>
+        <w:pStyle w:val="Odlomakpopisa"/>
+        <w:numPr>
+          <w:ilvl w:val="0"/>
+          <w:numId w:val="5"/>
+        </w:numPr>
+      </w:pPr>
+      <w:r>
+        <w:t xml:space="preserve">A </w:t>
+      </w:r>
+      <w:proofErr w:type="spellStart"/>
+      <w:r>
+        <w:t>configurable</w:t>
+      </w:r>
+      <w:proofErr w:type="spellEnd"/>
+      <w:r>
+        <w:t xml:space="preserve"> hit </w:t>
+      </w:r>
+      <w:proofErr w:type="spellStart"/>
+      <w:r>
+        <w:t>detection</w:t>
+      </w:r>
+      <w:proofErr w:type="spellEnd"/>
+      <w:r>
+        <w:t xml:space="preserve"> </w:t>
+      </w:r>
+      <w:proofErr w:type="spellStart"/>
+      <w:r>
+        <w:t>method</w:t>
+      </w:r>
+      <w:proofErr w:type="spellEnd"/>
+      <w:r>
+        <w:t xml:space="preserve"> </w:t>
+      </w:r>
+      <w:proofErr w:type="spellStart"/>
+      <w:r>
+        <w:t>based</w:t>
+      </w:r>
+      <w:proofErr w:type="spellEnd"/>
+      <w:r>
+        <w:t xml:space="preserve"> on </w:t>
+      </w:r>
+      <w:proofErr w:type="spellStart"/>
+      <w:r>
+        <w:t>peak</w:t>
+      </w:r>
+      <w:proofErr w:type="spellEnd"/>
+      <w:r>
+        <w:t xml:space="preserve"> </w:t>
+      </w:r>
+      <w:proofErr w:type="spellStart"/>
+      <w:r>
+        <w:t>detection</w:t>
+      </w:r>
+      <w:proofErr w:type="spellEnd"/>
+      <w:r>
+        <w:t xml:space="preserve"> </w:t>
+      </w:r>
+      <w:proofErr w:type="spellStart"/>
+      <w:r>
+        <w:t>suited</w:t>
+      </w:r>
+      <w:proofErr w:type="spellEnd"/>
+      <w:r>
+        <w:t xml:space="preserve"> for </w:t>
+      </w:r>
+      <w:proofErr w:type="spellStart"/>
+      <w:r>
+        <w:t>noisy</w:t>
+      </w:r>
+      <w:proofErr w:type="spellEnd"/>
+      <w:r>
+        <w:t xml:space="preserve"> time-</w:t>
+      </w:r>
+      <w:proofErr w:type="spellStart"/>
+      <w:r>
+        <w:t>series</w:t>
+      </w:r>
+      <w:proofErr w:type="spellEnd"/>
+      <w:r>
+        <w:t xml:space="preserve"> </w:t>
+      </w:r>
+      <w:proofErr w:type="spellStart"/>
+      <w:r>
+        <w:t>signals</w:t>
+      </w:r>
+      <w:proofErr w:type="spellEnd"/>
+      <w:r>
+        <w:t xml:space="preserve"> </w:t>
+      </w:r>
+      <w:proofErr w:type="spellStart"/>
+      <w:r>
+        <w:t>generated</w:t>
+      </w:r>
+      <w:proofErr w:type="spellEnd"/>
+      <w:r>
+        <w:t xml:space="preserve"> </w:t>
+      </w:r>
+      <w:proofErr w:type="spellStart"/>
+      <w:r>
+        <w:t>by</w:t>
+      </w:r>
+      <w:proofErr w:type="spellEnd"/>
+      <w:r>
+        <w:t xml:space="preserve"> a </w:t>
+      </w:r>
+      <w:proofErr w:type="spellStart"/>
+      <w:r>
+        <w:t>boxing</w:t>
+      </w:r>
+      <w:proofErr w:type="spellEnd"/>
+      <w:r>
+        <w:t xml:space="preserve"> </w:t>
+      </w:r>
+      <w:proofErr w:type="spellStart"/>
+      <w:r>
+        <w:t>bag</w:t>
+      </w:r>
+      <w:proofErr w:type="spellEnd"/>
+      <w:r>
+        <w:t>.</w:t>
+      </w:r>
+    </w:p>
     <w:p/>
     <w:p/>
     <w:sectPr>
@@ -2674,13 +5482,13 @@
     </w:lvl>
   </w:abstractNum>
   <w:abstractNum w:abstractNumId="1" w15:restartNumberingAfterBreak="0">
-    <w:nsid w:val="5570020E"/>
+    <w:nsid w:val="22375C18"/>
     <w:multiLevelType w:val="hybridMultilevel"/>
-    <w:tmpl w:val="2FEA7942"/>
-    <w:lvl w:ilvl="0" w:tplc="041A000F">
+    <w:tmpl w:val="9208DA22"/>
+    <w:lvl w:ilvl="0" w:tplc="5D8ADE98">
       <w:start w:val="1"/>
       <w:numFmt w:val="decimal"/>
-      <w:lvlText w:val="%1."/>
+      <w:lvlText w:val="[%1]"/>
       <w:lvlJc w:val="left"/>
       <w:pPr>
         <w:ind w:left="720" w:hanging="360"/>
@@ -2763,6 +5571,184 @@
     </w:lvl>
   </w:abstractNum>
   <w:abstractNum w:abstractNumId="2" w15:restartNumberingAfterBreak="0">
+    <w:nsid w:val="4DAD2B27"/>
+    <w:multiLevelType w:val="hybridMultilevel"/>
+    <w:tmpl w:val="0DDAB0E4"/>
+    <w:lvl w:ilvl="0" w:tplc="041A000F">
+      <w:start w:val="1"/>
+      <w:numFmt w:val="decimal"/>
+      <w:lvlText w:val="%1."/>
+      <w:lvlJc w:val="left"/>
+      <w:pPr>
+        <w:ind w:left="720" w:hanging="360"/>
+      </w:pPr>
+      <w:rPr>
+        <w:rFonts w:hint="default"/>
+      </w:rPr>
+    </w:lvl>
+    <w:lvl w:ilvl="1" w:tplc="041A0019" w:tentative="1">
+      <w:start w:val="1"/>
+      <w:numFmt w:val="lowerLetter"/>
+      <w:lvlText w:val="%2."/>
+      <w:lvlJc w:val="left"/>
+      <w:pPr>
+        <w:ind w:left="1440" w:hanging="360"/>
+      </w:pPr>
+    </w:lvl>
+    <w:lvl w:ilvl="2" w:tplc="041A001B" w:tentative="1">
+      <w:start w:val="1"/>
+      <w:numFmt w:val="lowerRoman"/>
+      <w:lvlText w:val="%3."/>
+      <w:lvlJc w:val="right"/>
+      <w:pPr>
+        <w:ind w:left="2160" w:hanging="180"/>
+      </w:pPr>
+    </w:lvl>
+    <w:lvl w:ilvl="3" w:tplc="041A000F" w:tentative="1">
+      <w:start w:val="1"/>
+      <w:numFmt w:val="decimal"/>
+      <w:lvlText w:val="%4."/>
+      <w:lvlJc w:val="left"/>
+      <w:pPr>
+        <w:ind w:left="2880" w:hanging="360"/>
+      </w:pPr>
+    </w:lvl>
+    <w:lvl w:ilvl="4" w:tplc="041A0019" w:tentative="1">
+      <w:start w:val="1"/>
+      <w:numFmt w:val="lowerLetter"/>
+      <w:lvlText w:val="%5."/>
+      <w:lvlJc w:val="left"/>
+      <w:pPr>
+        <w:ind w:left="3600" w:hanging="360"/>
+      </w:pPr>
+    </w:lvl>
+    <w:lvl w:ilvl="5" w:tplc="041A001B" w:tentative="1">
+      <w:start w:val="1"/>
+      <w:numFmt w:val="lowerRoman"/>
+      <w:lvlText w:val="%6."/>
+      <w:lvlJc w:val="right"/>
+      <w:pPr>
+        <w:ind w:left="4320" w:hanging="180"/>
+      </w:pPr>
+    </w:lvl>
+    <w:lvl w:ilvl="6" w:tplc="041A000F" w:tentative="1">
+      <w:start w:val="1"/>
+      <w:numFmt w:val="decimal"/>
+      <w:lvlText w:val="%7."/>
+      <w:lvlJc w:val="left"/>
+      <w:pPr>
+        <w:ind w:left="5040" w:hanging="360"/>
+      </w:pPr>
+    </w:lvl>
+    <w:lvl w:ilvl="7" w:tplc="041A0019" w:tentative="1">
+      <w:start w:val="1"/>
+      <w:numFmt w:val="lowerLetter"/>
+      <w:lvlText w:val="%8."/>
+      <w:lvlJc w:val="left"/>
+      <w:pPr>
+        <w:ind w:left="5760" w:hanging="360"/>
+      </w:pPr>
+    </w:lvl>
+    <w:lvl w:ilvl="8" w:tplc="041A001B" w:tentative="1">
+      <w:start w:val="1"/>
+      <w:numFmt w:val="lowerRoman"/>
+      <w:lvlText w:val="%9."/>
+      <w:lvlJc w:val="right"/>
+      <w:pPr>
+        <w:ind w:left="6480" w:hanging="180"/>
+      </w:pPr>
+    </w:lvl>
+  </w:abstractNum>
+  <w:abstractNum w:abstractNumId="3" w15:restartNumberingAfterBreak="0">
+    <w:nsid w:val="5570020E"/>
+    <w:multiLevelType w:val="hybridMultilevel"/>
+    <w:tmpl w:val="2FEA7942"/>
+    <w:lvl w:ilvl="0" w:tplc="041A000F">
+      <w:start w:val="1"/>
+      <w:numFmt w:val="decimal"/>
+      <w:lvlText w:val="%1."/>
+      <w:lvlJc w:val="left"/>
+      <w:pPr>
+        <w:ind w:left="720" w:hanging="360"/>
+      </w:pPr>
+      <w:rPr>
+        <w:rFonts w:hint="default"/>
+      </w:rPr>
+    </w:lvl>
+    <w:lvl w:ilvl="1" w:tplc="041A0019" w:tentative="1">
+      <w:start w:val="1"/>
+      <w:numFmt w:val="lowerLetter"/>
+      <w:lvlText w:val="%2."/>
+      <w:lvlJc w:val="left"/>
+      <w:pPr>
+        <w:ind w:left="1440" w:hanging="360"/>
+      </w:pPr>
+    </w:lvl>
+    <w:lvl w:ilvl="2" w:tplc="041A001B" w:tentative="1">
+      <w:start w:val="1"/>
+      <w:numFmt w:val="lowerRoman"/>
+      <w:lvlText w:val="%3."/>
+      <w:lvlJc w:val="right"/>
+      <w:pPr>
+        <w:ind w:left="2160" w:hanging="180"/>
+      </w:pPr>
+    </w:lvl>
+    <w:lvl w:ilvl="3" w:tplc="041A000F" w:tentative="1">
+      <w:start w:val="1"/>
+      <w:numFmt w:val="decimal"/>
+      <w:lvlText w:val="%4."/>
+      <w:lvlJc w:val="left"/>
+      <w:pPr>
+        <w:ind w:left="2880" w:hanging="360"/>
+      </w:pPr>
+    </w:lvl>
+    <w:lvl w:ilvl="4" w:tplc="041A0019" w:tentative="1">
+      <w:start w:val="1"/>
+      <w:numFmt w:val="lowerLetter"/>
+      <w:lvlText w:val="%5."/>
+      <w:lvlJc w:val="left"/>
+      <w:pPr>
+        <w:ind w:left="3600" w:hanging="360"/>
+      </w:pPr>
+    </w:lvl>
+    <w:lvl w:ilvl="5" w:tplc="041A001B" w:tentative="1">
+      <w:start w:val="1"/>
+      <w:numFmt w:val="lowerRoman"/>
+      <w:lvlText w:val="%6."/>
+      <w:lvlJc w:val="right"/>
+      <w:pPr>
+        <w:ind w:left="4320" w:hanging="180"/>
+      </w:pPr>
+    </w:lvl>
+    <w:lvl w:ilvl="6" w:tplc="041A000F" w:tentative="1">
+      <w:start w:val="1"/>
+      <w:numFmt w:val="decimal"/>
+      <w:lvlText w:val="%7."/>
+      <w:lvlJc w:val="left"/>
+      <w:pPr>
+        <w:ind w:left="5040" w:hanging="360"/>
+      </w:pPr>
+    </w:lvl>
+    <w:lvl w:ilvl="7" w:tplc="041A0019" w:tentative="1">
+      <w:start w:val="1"/>
+      <w:numFmt w:val="lowerLetter"/>
+      <w:lvlText w:val="%8."/>
+      <w:lvlJc w:val="left"/>
+      <w:pPr>
+        <w:ind w:left="5760" w:hanging="360"/>
+      </w:pPr>
+    </w:lvl>
+    <w:lvl w:ilvl="8" w:tplc="041A001B" w:tentative="1">
+      <w:start w:val="1"/>
+      <w:numFmt w:val="lowerRoman"/>
+      <w:lvlText w:val="%9."/>
+      <w:lvlJc w:val="right"/>
+      <w:pPr>
+        <w:ind w:left="6480" w:hanging="180"/>
+      </w:pPr>
+    </w:lvl>
+  </w:abstractNum>
+  <w:abstractNum w:abstractNumId="4" w15:restartNumberingAfterBreak="0">
     <w:nsid w:val="73F7143A"/>
     <w:multiLevelType w:val="multilevel"/>
     <w:tmpl w:val="041A0025"/>
@@ -2858,13 +5844,19 @@
     </w:lvl>
   </w:abstractNum>
   <w:num w:numId="1" w16cid:durableId="2063477168">
-    <w:abstractNumId w:val="2"/>
+    <w:abstractNumId w:val="4"/>
   </w:num>
   <w:num w:numId="2" w16cid:durableId="1563328335">
     <w:abstractNumId w:val="0"/>
   </w:num>
   <w:num w:numId="3" w16cid:durableId="1664236431">
+    <w:abstractNumId w:val="3"/>
+  </w:num>
+  <w:num w:numId="4" w16cid:durableId="309409045">
     <w:abstractNumId w:val="1"/>
+  </w:num>
+  <w:num w:numId="5" w16cid:durableId="1572961521">
+    <w:abstractNumId w:val="2"/>
   </w:num>
 </w:numbering>
 </file>
@@ -3862,6 +6854,30 @@
       <w:ind w:left="240"/>
     </w:pPr>
   </w:style>
+  <w:style w:type="character" w:styleId="Nerijeenospominjanje">
+    <w:name w:val="Unresolved Mention"/>
+    <w:basedOn w:val="Zadanifontodlomka"/>
+    <w:uiPriority w:val="99"/>
+    <w:semiHidden/>
+    <w:unhideWhenUsed/>
+    <w:rsid w:val="0008632E"/>
+    <w:rPr>
+      <w:color w:val="605E5C"/>
+      <w:shd w:val="clear" w:color="auto" w:fill="E1DFDD"/>
+    </w:rPr>
+  </w:style>
+  <w:style w:type="character" w:styleId="SlijeenaHiperveza">
+    <w:name w:val="FollowedHyperlink"/>
+    <w:basedOn w:val="Zadanifontodlomka"/>
+    <w:uiPriority w:val="99"/>
+    <w:semiHidden/>
+    <w:unhideWhenUsed/>
+    <w:rsid w:val="00DC53A1"/>
+    <w:rPr>
+      <w:color w:val="96607D" w:themeColor="followedHyperlink"/>
+      <w:u w:val="single"/>
+    </w:rPr>
+  </w:style>
 </w:styles>
 </file>
 

</xml_diff>